<commit_message>
docs: add achievements and best 5 certifications to resume
</commit_message>
<xml_diff>
--- a/asserts/Suresh_S_Resume.docx
+++ b/asserts/Suresh_S_Resume.docx
@@ -2396,6 +2396,514 @@
           <w:szCs w:val="17"/>
         </w:rPr>
         <w:t xml:space="preserve">  Ranked in top cohort among 33,252 certified candidates</w:t>
+      </w:r>
+    </w:p>
+    <w:p>
+      <w:pPr>
+        <w:spacing w:before="0" w:after="0" w:line="60" w:lineRule="exact"/>
+      </w:pPr>
+    </w:p>
+    <w:tbl>
+      <w:tblPr>
+        <w:tblW w:type="auto" w:w="0"/>
+        <w:tblLook w:firstColumn="1" w:firstRow="1" w:lastColumn="0" w:lastRow="0" w:noHBand="0" w:noVBand="1" w:val="04A0"/>
+      </w:tblPr>
+      <w:tblGrid>
+        <w:gridCol w:w="3360"/>
+        <w:gridCol w:w="3360"/>
+        <w:gridCol w:w="3360"/>
+      </w:tblGrid>
+      <w:tr>
+        <w:tc>
+          <w:tcPr>
+            <w:tcW w:type="dxa" w:w="4200"/>
+          </w:tcPr>
+          <w:p>
+            <w:pPr>
+              <w:spacing w:before="0" w:after="0" w:line="276" w:lineRule="auto"/>
+            </w:pPr>
+            <w:r>
+              <w:rPr>
+                <w:b/>
+              </w:rPr>
+              <w:t>AI &amp; Machine Learning in Java</w:t>
+            </w:r>
+          </w:p>
+        </w:tc>
+        <w:tc>
+          <w:tcPr>
+            <w:tcW w:type="dxa" w:w="3000"/>
+          </w:tcPr>
+          <w:p>
+            <w:pPr>
+              <w:spacing w:before="0" w:after="0" w:line="276" w:lineRule="auto"/>
+            </w:pPr>
+            <w:r>
+              <w:rPr>
+                <w:sz w:val="19"/>
+              </w:rPr>
+              <w:t>Oracle Academy</w:t>
+            </w:r>
+          </w:p>
+        </w:tc>
+        <w:tc>
+          <w:tcPr>
+            <w:tcW w:type="dxa" w:w="2160"/>
+          </w:tcPr>
+          <w:p>
+            <w:pPr>
+              <w:spacing w:before="0" w:after="0" w:line="276" w:lineRule="auto"/>
+            </w:pPr>
+            <w:r>
+              <w:rPr>
+                <w:b w:val="0"/>
+                <w:sz w:val="19"/>
+              </w:rPr>
+              <w:t>Nov 2025</w:t>
+            </w:r>
+          </w:p>
+        </w:tc>
+      </w:tr>
+    </w:tbl>
+    <w:p>
+      <w:pPr>
+        <w:spacing w:before="20" w:after="80" w:line="276" w:lineRule="auto"/>
+      </w:pPr>
+      <w:r>
+        <w:rPr>
+          <w:sz w:val="18"/>
+        </w:rPr>
+        <w:t>Granted by Oracle Academy. Hands-on program covering neural networks, deep learning models, and Java integration.</w:t>
+      </w:r>
+    </w:p>
+    <w:p>
+      <w:pPr>
+        <w:spacing w:before="0" w:after="0" w:line="60" w:lineRule="exact"/>
+      </w:pPr>
+    </w:p>
+    <w:tbl>
+      <w:tblPr>
+        <w:tblW w:type="auto" w:w="0"/>
+        <w:tblLook w:firstColumn="1" w:firstRow="1" w:lastColumn="0" w:lastRow="0" w:noHBand="0" w:noVBand="1" w:val="04A0"/>
+      </w:tblPr>
+      <w:tblGrid>
+        <w:gridCol w:w="3360"/>
+        <w:gridCol w:w="3360"/>
+        <w:gridCol w:w="3360"/>
+      </w:tblGrid>
+      <w:tr>
+        <w:tc>
+          <w:tcPr>
+            <w:tcW w:type="dxa" w:w="4200"/>
+          </w:tcPr>
+          <w:p>
+            <w:pPr>
+              <w:spacing w:before="0" w:after="0" w:line="276" w:lineRule="auto"/>
+            </w:pPr>
+            <w:r>
+              <w:rPr>
+                <w:b/>
+              </w:rPr>
+              <w:t>C Programming</w:t>
+            </w:r>
+          </w:p>
+        </w:tc>
+        <w:tc>
+          <w:tcPr>
+            <w:tcW w:type="dxa" w:w="3000"/>
+          </w:tcPr>
+          <w:p>
+            <w:pPr>
+              <w:spacing w:before="0" w:after="0" w:line="276" w:lineRule="auto"/>
+            </w:pPr>
+            <w:r>
+              <w:rPr>
+                <w:sz w:val="19"/>
+              </w:rPr>
+              <w:t>IIT Bombay (Spoken Tutorial)</w:t>
+            </w:r>
+          </w:p>
+        </w:tc>
+        <w:tc>
+          <w:tcPr>
+            <w:tcW w:type="dxa" w:w="2160"/>
+          </w:tcPr>
+          <w:p>
+            <w:pPr>
+              <w:spacing w:before="0" w:after="0" w:line="276" w:lineRule="auto"/>
+            </w:pPr>
+            <w:r>
+              <w:rPr>
+                <w:b/>
+                <w:sz w:val="19"/>
+              </w:rPr>
+              <w:t>92% Score</w:t>
+            </w:r>
+            <w:r>
+              <w:rPr>
+                <w:b w:val="0"/>
+                <w:sz w:val="19"/>
+              </w:rPr>
+              <w:t xml:space="preserve">  |  2025</w:t>
+            </w:r>
+          </w:p>
+        </w:tc>
+      </w:tr>
+    </w:tbl>
+    <w:p>
+      <w:pPr>
+        <w:spacing w:before="20" w:after="80" w:line="276" w:lineRule="auto"/>
+      </w:pPr>
+      <w:r>
+        <w:rPr>
+          <w:sz w:val="18"/>
+        </w:rPr>
+        <w:t>Organized by Sree Sakthi Engineering College and invigilated remotely by Spoken Tutorial Project, IIT Bombay.</w:t>
+      </w:r>
+    </w:p>
+    <w:p>
+      <w:pPr>
+        <w:spacing w:before="0" w:after="0" w:line="60" w:lineRule="exact"/>
+      </w:pPr>
+    </w:p>
+    <w:tbl>
+      <w:tblPr>
+        <w:tblW w:type="auto" w:w="0"/>
+        <w:tblLook w:firstColumn="1" w:firstRow="1" w:lastColumn="0" w:lastRow="0" w:noHBand="0" w:noVBand="1" w:val="04A0"/>
+      </w:tblPr>
+      <w:tblGrid>
+        <w:gridCol w:w="3360"/>
+        <w:gridCol w:w="3360"/>
+        <w:gridCol w:w="3360"/>
+      </w:tblGrid>
+      <w:tr>
+        <w:tc>
+          <w:tcPr>
+            <w:tcW w:type="dxa" w:w="4200"/>
+          </w:tcPr>
+          <w:p>
+            <w:pPr>
+              <w:spacing w:before="0" w:after="0" w:line="276" w:lineRule="auto"/>
+            </w:pPr>
+            <w:r>
+              <w:rPr>
+                <w:b/>
+              </w:rPr>
+              <w:t>C++ Programming</w:t>
+            </w:r>
+          </w:p>
+        </w:tc>
+        <w:tc>
+          <w:tcPr>
+            <w:tcW w:type="dxa" w:w="3000"/>
+          </w:tcPr>
+          <w:p>
+            <w:pPr>
+              <w:spacing w:before="0" w:after="0" w:line="276" w:lineRule="auto"/>
+            </w:pPr>
+            <w:r>
+              <w:rPr>
+                <w:sz w:val="19"/>
+              </w:rPr>
+              <w:t>IIT Bombay (Spoken Tutorial)</w:t>
+            </w:r>
+          </w:p>
+        </w:tc>
+        <w:tc>
+          <w:tcPr>
+            <w:tcW w:type="dxa" w:w="2160"/>
+          </w:tcPr>
+          <w:p>
+            <w:pPr>
+              <w:spacing w:before="0" w:after="0" w:line="276" w:lineRule="auto"/>
+            </w:pPr>
+            <w:r>
+              <w:rPr>
+                <w:b/>
+                <w:sz w:val="19"/>
+              </w:rPr>
+              <w:t>85% Score</w:t>
+            </w:r>
+            <w:r>
+              <w:rPr>
+                <w:b w:val="0"/>
+                <w:sz w:val="19"/>
+              </w:rPr>
+              <w:t xml:space="preserve">  |  2025</w:t>
+            </w:r>
+          </w:p>
+        </w:tc>
+      </w:tr>
+    </w:tbl>
+    <w:p>
+      <w:pPr>
+        <w:spacing w:before="20" w:after="80" w:line="276" w:lineRule="auto"/>
+      </w:pPr>
+      <w:r>
+        <w:rPr>
+          <w:sz w:val="18"/>
+        </w:rPr>
+        <w:t>Organized by Sree Sakthi Engineering College and invigilated remotely by Spoken Tutorial Project, IIT Bombay.</w:t>
+      </w:r>
+    </w:p>
+    <w:p>
+      <w:pPr>
+        <w:spacing w:before="0" w:after="0" w:line="60" w:lineRule="exact"/>
+      </w:pPr>
+    </w:p>
+    <w:tbl>
+      <w:tblPr>
+        <w:tblW w:type="auto" w:w="0"/>
+        <w:tblLook w:firstColumn="1" w:firstRow="1" w:lastColumn="0" w:lastRow="0" w:noHBand="0" w:noVBand="1" w:val="04A0"/>
+      </w:tblPr>
+      <w:tblGrid>
+        <w:gridCol w:w="3360"/>
+        <w:gridCol w:w="3360"/>
+        <w:gridCol w:w="3360"/>
+      </w:tblGrid>
+      <w:tr>
+        <w:tc>
+          <w:tcPr>
+            <w:tcW w:type="dxa" w:w="4200"/>
+          </w:tcPr>
+          <w:p>
+            <w:pPr>
+              <w:spacing w:before="0" w:after="0" w:line="276" w:lineRule="auto"/>
+            </w:pPr>
+            <w:r>
+              <w:rPr>
+                <w:b/>
+              </w:rPr>
+              <w:t>Python 3.4.3</w:t>
+            </w:r>
+          </w:p>
+        </w:tc>
+        <w:tc>
+          <w:tcPr>
+            <w:tcW w:type="dxa" w:w="3000"/>
+          </w:tcPr>
+          <w:p>
+            <w:pPr>
+              <w:spacing w:before="0" w:after="0" w:line="276" w:lineRule="auto"/>
+            </w:pPr>
+            <w:r>
+              <w:rPr>
+                <w:sz w:val="19"/>
+              </w:rPr>
+              <w:t>IIT Bombay (Spoken Tutorial)</w:t>
+            </w:r>
+          </w:p>
+        </w:tc>
+        <w:tc>
+          <w:tcPr>
+            <w:tcW w:type="dxa" w:w="2160"/>
+          </w:tcPr>
+          <w:p>
+            <w:pPr>
+              <w:spacing w:before="0" w:after="0" w:line="276" w:lineRule="auto"/>
+            </w:pPr>
+            <w:r>
+              <w:rPr>
+                <w:b/>
+                <w:sz w:val="19"/>
+              </w:rPr>
+              <w:t>80% Score</w:t>
+            </w:r>
+            <w:r>
+              <w:rPr>
+                <w:b w:val="0"/>
+                <w:sz w:val="19"/>
+              </w:rPr>
+              <w:t xml:space="preserve">  |  2025</w:t>
+            </w:r>
+          </w:p>
+        </w:tc>
+      </w:tr>
+    </w:tbl>
+    <w:p>
+      <w:pPr>
+        <w:spacing w:before="20" w:after="80" w:line="276" w:lineRule="auto"/>
+      </w:pPr>
+      <w:r>
+        <w:rPr>
+          <w:sz w:val="18"/>
+        </w:rPr>
+        <w:t>Organized by Sree Sakthi Engineering College and invigilated remotely by Spoken Tutorial Project, IIT Bombay.</w:t>
+      </w:r>
+    </w:p>
+    <w:p>
+      <w:pPr>
+        <w:spacing w:before="0" w:after="0" w:line="60" w:lineRule="exact"/>
+      </w:pPr>
+    </w:p>
+    <w:tbl>
+      <w:tblPr>
+        <w:tblW w:type="auto" w:w="0"/>
+        <w:tblLook w:firstColumn="1" w:firstRow="1" w:lastColumn="0" w:lastRow="0" w:noHBand="0" w:noVBand="1" w:val="04A0"/>
+      </w:tblPr>
+      <w:tblGrid>
+        <w:gridCol w:w="3360"/>
+        <w:gridCol w:w="3360"/>
+        <w:gridCol w:w="3360"/>
+      </w:tblGrid>
+      <w:tr>
+        <w:tc>
+          <w:tcPr>
+            <w:tcW w:type="dxa" w:w="4200"/>
+          </w:tcPr>
+          <w:p>
+            <w:pPr>
+              <w:spacing w:before="0" w:after="0" w:line="276" w:lineRule="auto"/>
+            </w:pPr>
+            <w:r>
+              <w:rPr>
+                <w:b/>
+              </w:rPr>
+              <w:t>7+ Competency Certificates</w:t>
+            </w:r>
+          </w:p>
+        </w:tc>
+        <w:tc>
+          <w:tcPr>
+            <w:tcW w:type="dxa" w:w="3000"/>
+          </w:tcPr>
+          <w:p>
+            <w:pPr>
+              <w:spacing w:before="0" w:after="0" w:line="276" w:lineRule="auto"/>
+            </w:pPr>
+            <w:r>
+              <w:rPr>
+                <w:sz w:val="19"/>
+              </w:rPr>
+              <w:t>Infosys Springboard</w:t>
+            </w:r>
+          </w:p>
+        </w:tc>
+        <w:tc>
+          <w:tcPr>
+            <w:tcW w:type="dxa" w:w="2160"/>
+          </w:tcPr>
+          <w:p>
+            <w:pPr>
+              <w:spacing w:before="0" w:after="0" w:line="276" w:lineRule="auto"/>
+            </w:pPr>
+            <w:r>
+              <w:rPr>
+                <w:b/>
+                <w:sz w:val="19"/>
+              </w:rPr>
+              <w:t>Verified</w:t>
+            </w:r>
+          </w:p>
+        </w:tc>
+      </w:tr>
+    </w:tbl>
+    <w:p>
+      <w:pPr>
+        <w:spacing w:before="20" w:after="80" w:line="276" w:lineRule="auto"/>
+      </w:pPr>
+      <w:r>
+        <w:rPr>
+          <w:sz w:val="18"/>
+        </w:rPr>
+        <w:t>Verify competency certificates at: infyspringboard.onwingspan.com/web/en/app/profile/competency/certificate</w:t>
+      </w:r>
+    </w:p>
+    <w:p>
+      <w:pPr>
+        <w:spacing w:before="0" w:after="0" w:line="60" w:lineRule="exact"/>
+      </w:pPr>
+    </w:p>
+    <w:p>
+      <w:pPr>
+        <w:spacing w:before="200" w:after="60" w:line="276" w:lineRule="auto"/>
+      </w:pPr>
+      <w:r>
+        <w:rPr>
+          <w:b/>
+          <w:sz w:val="22"/>
+        </w:rPr>
+        <w:t>ACHIEVEMENTS</w:t>
+      </w:r>
+    </w:p>
+    <w:p>
+      <w:pPr>
+        <w:spacing w:before="40" w:after="40" w:line="276" w:lineRule="auto"/>
+      </w:pPr>
+      <w:r>
+        <w:rPr>
+          <w:b/>
+        </w:rPr>
+        <w:t xml:space="preserve">▸  </w:t>
+      </w:r>
+      <w:r>
+        <w:rPr>
+          <w:b/>
+        </w:rPr>
+        <w:t>Smart India Hackathon (SIH) Participant</w:t>
+      </w:r>
+      <w:r>
+        <w:t xml:space="preserve"> — Shortlisted for competing in nationwide problem-solving challenges using cloud computing modules.</w:t>
+      </w:r>
+    </w:p>
+    <w:p>
+      <w:pPr>
+        <w:spacing w:before="40" w:after="40" w:line="276" w:lineRule="auto"/>
+      </w:pPr>
+      <w:r>
+        <w:rPr>
+          <w:b/>
+        </w:rPr>
+        <w:t xml:space="preserve">▸  </w:t>
+      </w:r>
+      <w:r>
+        <w:rPr>
+          <w:b/>
+        </w:rPr>
+        <w:t>3rd Place, College Hackathon</w:t>
+      </w:r>
+      <w:r>
+        <w:t xml:space="preserve"> — Awarded for engineering an automated digital interface solution under intense timeline pressure.</w:t>
+      </w:r>
+    </w:p>
+    <w:p>
+      <w:pPr>
+        <w:spacing w:before="40" w:after="40" w:line="276" w:lineRule="auto"/>
+      </w:pPr>
+      <w:r>
+        <w:rPr>
+          <w:b/>
+        </w:rPr>
+        <w:t xml:space="preserve">▸  </w:t>
+      </w:r>
+      <w:r>
+        <w:rPr>
+          <w:b/>
+        </w:rPr>
+        <w:t>National Conference Speaker/Participant</w:t>
+      </w:r>
+      <w:r>
+        <w:t xml:space="preserve"> — Presented research abstracts evaluating security parameters in cloud and e-learning databases.</w:t>
+      </w:r>
+    </w:p>
+    <w:p>
+      <w:pPr>
+        <w:spacing w:before="40" w:after="40" w:line="276" w:lineRule="auto"/>
+      </w:pPr>
+      <w:r>
+        <w:rPr>
+          <w:b/>
+        </w:rPr>
+        <w:t xml:space="preserve">▸  </w:t>
+      </w:r>
+      <w:r>
+        <w:rPr>
+          <w:b/>
+        </w:rPr>
+        <w:t>HackerRank Gold Badge in Python</w:t>
+      </w:r>
+      <w:r>
+        <w:t xml:space="preserve"> — Earned Python coding badges with high algorithmic accuracy on challenging hacker rank coding boards (hackerrank.com/profile/s_suresh63808661).</w:t>
       </w:r>
     </w:p>
     <w:p>

</xml_diff>

<commit_message>
docs: compress resume to 2 pages, fix certificate cell alignments to match NPTEL layout
</commit_message>
<xml_diff>
--- a/asserts/Suresh_S_Resume.docx
+++ b/asserts/Suresh_S_Resume.docx
@@ -4,7 +4,7 @@
   <w:body>
     <w:p>
       <w:pPr>
-        <w:spacing w:after="60"/>
+        <w:spacing w:before="20" w:after="20" w:line="252" w:lineRule="auto"/>
         <w:jc w:val="center"/>
       </w:pPr>
       <w:r>
@@ -20,7 +20,7 @@
     </w:p>
     <w:p>
       <w:pPr>
-        <w:spacing w:after="40"/>
+        <w:spacing w:before="20" w:after="20" w:line="252" w:lineRule="auto"/>
         <w:jc w:val="center"/>
       </w:pPr>
       <w:r>
@@ -29,59 +29,23 @@
           <w:sz w:val="22"/>
           <w:szCs w:val="22"/>
         </w:rPr>
-        <w:t xml:space="preserve">Full-Stack &amp; AI Web </w:t>
-      </w:r>
-      <w:proofErr w:type="gramStart"/>
+        <w:t>Full-Stack &amp; AI Web Developer  |  Founder</w:t>
+      </w:r>
       <w:r>
         <w:rPr>
           <w:color w:val="566573"/>
           <w:sz w:val="22"/>
           <w:szCs w:val="22"/>
         </w:rPr>
-        <w:t>Developer  |</w:t>
-      </w:r>
-      <w:proofErr w:type="gramEnd"/>
+        <w:t xml:space="preserve"> at</w:t>
+      </w:r>
       <w:r>
         <w:rPr>
           <w:color w:val="566573"/>
           <w:sz w:val="22"/>
           <w:szCs w:val="22"/>
         </w:rPr>
-        <w:t xml:space="preserve">  Founder</w:t>
-      </w:r>
-      <w:r>
-        <w:rPr>
-          <w:color w:val="566573"/>
-          <w:sz w:val="22"/>
-          <w:szCs w:val="22"/>
-        </w:rPr>
-        <w:t xml:space="preserve"> at</w:t>
-      </w:r>
-      <w:r>
-        <w:rPr>
-          <w:color w:val="566573"/>
-          <w:sz w:val="22"/>
-          <w:szCs w:val="22"/>
-        </w:rPr>
-        <w:t xml:space="preserve"> </w:t>
-      </w:r>
-      <w:proofErr w:type="spellStart"/>
-      <w:r>
-        <w:rPr>
-          <w:color w:val="566573"/>
-          <w:sz w:val="22"/>
-          <w:szCs w:val="22"/>
-        </w:rPr>
-        <w:t>Shevara</w:t>
-      </w:r>
-      <w:proofErr w:type="spellEnd"/>
-      <w:r>
-        <w:rPr>
-          <w:color w:val="566573"/>
-          <w:sz w:val="22"/>
-          <w:szCs w:val="22"/>
-        </w:rPr>
-        <w:t xml:space="preserve"> Nexus</w:t>
+        <w:t xml:space="preserve"> Shevara Nexus</w:t>
       </w:r>
     </w:p>
     <w:tbl>
@@ -102,10 +66,10 @@
         <w:tblLook w:val="0000" w:firstRow="0" w:lastRow="0" w:firstColumn="0" w:lastColumn="0" w:noHBand="0" w:noVBand="0"/>
       </w:tblPr>
       <w:tblGrid>
-        <w:gridCol w:w="2340"/>
-        <w:gridCol w:w="2340"/>
-        <w:gridCol w:w="2340"/>
-        <w:gridCol w:w="2340"/>
+        <w:gridCol w:w="2705"/>
+        <w:gridCol w:w="2114"/>
+        <w:gridCol w:w="2272"/>
+        <w:gridCol w:w="2269"/>
       </w:tblGrid>
       <w:tr>
         <w:tc>
@@ -120,6 +84,7 @@
           </w:tcPr>
           <w:p>
             <w:pPr>
+              <w:spacing w:after="20" w:line="252" w:lineRule="auto"/>
               <w:jc w:val="center"/>
             </w:pPr>
             <w:r>
@@ -143,6 +108,9 @@
             </w:tcBorders>
           </w:tcPr>
           <w:p>
+            <w:pPr>
+              <w:spacing w:after="20" w:line="252" w:lineRule="auto"/>
+            </w:pPr>
             <w:r>
               <w:rPr>
                 <w:color w:val="566573"/>
@@ -164,24 +132,17 @@
             </w:tcBorders>
           </w:tcPr>
           <w:p>
+            <w:pPr>
+              <w:spacing w:after="20" w:line="252" w:lineRule="auto"/>
+            </w:pPr>
             <w:r>
               <w:rPr>
                 <w:color w:val="1A5276"/>
                 <w:sz w:val="18"/>
                 <w:szCs w:val="18"/>
               </w:rPr>
-              <w:t>linkedin.com/in/</w:t>
-            </w:r>
-            <w:proofErr w:type="spellStart"/>
-            <w:r>
-              <w:rPr>
-                <w:color w:val="1A5276"/>
-                <w:sz w:val="18"/>
-                <w:szCs w:val="18"/>
-              </w:rPr>
-              <w:t>sureshio</w:t>
-            </w:r>
-            <w:proofErr w:type="spellEnd"/>
+              <w:t>linkedin.com/in/sureshio</w:t>
+            </w:r>
           </w:p>
         </w:tc>
         <w:tc>
@@ -195,31 +156,16 @@
             </w:tcBorders>
           </w:tcPr>
           <w:p>
+            <w:pPr>
+              <w:spacing w:after="20" w:line="252" w:lineRule="auto"/>
+            </w:pPr>
             <w:r>
               <w:rPr>
                 <w:color w:val="1A5276"/>
                 <w:sz w:val="18"/>
                 <w:szCs w:val="18"/>
               </w:rPr>
-              <w:t>|</w:t>
-            </w:r>
-            <w:proofErr w:type="gramStart"/>
-            <w:r>
-              <w:rPr>
-                <w:color w:val="1A5276"/>
-                <w:sz w:val="18"/>
-                <w:szCs w:val="18"/>
-              </w:rPr>
-              <w:t>|  github.com</w:t>
-            </w:r>
-            <w:proofErr w:type="gramEnd"/>
-            <w:r>
-              <w:rPr>
-                <w:color w:val="1A5276"/>
-                <w:sz w:val="18"/>
-                <w:szCs w:val="18"/>
-              </w:rPr>
-              <w:t>/Suresh2160</w:t>
+              <w:t>||  github.com/Suresh2160</w:t>
             </w:r>
           </w:p>
         </w:tc>
@@ -227,7 +173,7 @@
     </w:tbl>
     <w:p>
       <w:pPr>
-        <w:spacing w:before="30"/>
+        <w:spacing w:before="20" w:after="20" w:line="252" w:lineRule="auto"/>
         <w:jc w:val="center"/>
       </w:pPr>
       <w:r>
@@ -236,18 +182,16 @@
           <w:sz w:val="18"/>
           <w:szCs w:val="18"/>
         </w:rPr>
-        <w:t xml:space="preserve">Coimbatore, Tamil </w:t>
-      </w:r>
-      <w:proofErr w:type="gramStart"/>
+        <w:t xml:space="preserve">Coimbatore, Tamil Nadu  | </w:t>
+      </w:r>
       <w:r>
         <w:rPr>
           <w:color w:val="566573"/>
           <w:sz w:val="18"/>
           <w:szCs w:val="18"/>
         </w:rPr>
-        <w:t>Nadu  |</w:t>
-      </w:r>
-      <w:proofErr w:type="gramEnd"/>
+        <w:t>|</w:t>
+      </w:r>
       <w:r>
         <w:rPr>
           <w:color w:val="566573"/>
@@ -262,39 +206,15 @@
           <w:sz w:val="18"/>
           <w:szCs w:val="18"/>
         </w:rPr>
-        <w:t>|</w:t>
-      </w:r>
-      <w:r>
-        <w:rPr>
-          <w:color w:val="566573"/>
-          <w:sz w:val="18"/>
-          <w:szCs w:val="18"/>
-        </w:rPr>
-        <w:t xml:space="preserve"> </w:t>
-      </w:r>
-      <w:r>
-        <w:rPr>
-          <w:color w:val="566573"/>
-          <w:sz w:val="18"/>
-          <w:szCs w:val="18"/>
-        </w:rPr>
         <w:t>https://suresh2160.github.io/portfolio1/</w:t>
       </w:r>
-    </w:p>
-    <w:p>
-      <w:pPr>
-        <w:pBdr>
-          <w:bottom w:val="single" w:sz="12" w:space="0" w:color="1A5276"/>
-        </w:pBdr>
-        <w:spacing w:before="160"/>
-      </w:pPr>
     </w:p>
     <w:p>
       <w:pPr>
         <w:pBdr>
           <w:bottom w:val="single" w:sz="8" w:space="4" w:color="1A5276"/>
         </w:pBdr>
-        <w:spacing w:before="200" w:after="60"/>
+        <w:spacing w:before="20" w:after="20" w:line="252" w:lineRule="auto"/>
       </w:pPr>
       <w:r>
         <w:rPr>
@@ -309,28 +229,13 @@
     </w:p>
     <w:p>
       <w:pPr>
-        <w:spacing w:before="60" w:after="60"/>
-      </w:pPr>
-      <w:r>
-        <w:t xml:space="preserve">Motivated </w:t>
-      </w:r>
-      <w:proofErr w:type="spellStart"/>
-      <w:proofErr w:type="gramStart"/>
-      <w:r>
-        <w:t>B.Tech</w:t>
-      </w:r>
-      <w:proofErr w:type="spellEnd"/>
-      <w:proofErr w:type="gramEnd"/>
-      <w:r>
-        <w:t xml:space="preserve"> IT student and aspiring founder with hands-on experience in full-stack and AI-powered web development. Currently interning as an AI-Powered Web Developer at RAD InfoTech, building production-grade tools that enhance digital operations. Founder of </w:t>
-      </w:r>
-      <w:proofErr w:type="spellStart"/>
-      <w:r>
-        <w:t>Shevara</w:t>
-      </w:r>
-      <w:proofErr w:type="spellEnd"/>
-      <w:r>
-        <w:t xml:space="preserve"> Nexus, developing AI-driven software products. NPTEL Elite certified in Cloud Computing (IIT Kharagpur, 82%). Proven ability to ship end-to-end web applications across EdTech, productivity, and AI domains using React.js, Node.js, MongoDB, and Firebase.</w:t>
+        <w:spacing w:before="20" w:after="20" w:line="252" w:lineRule="auto"/>
+      </w:pPr>
+      <w:r>
+        <w:t>Motivated B.Tech IT student and aspiring founder with hands-on experience in full-stack and AI-powered web development. Currently interning as an AI-Powered Web Developer at RAD InfoTech, building production-grade tools that enhance digital operations. Founder of Shevara Nexus, developing AI-driven software products. NPTEL Elite certified in Cloud Computing (IIT Kharagpur, 82%). Proven ability to ship end-to-end web applications across EdTech, productivity, and AI domains using React.js, Node.js, MongoDB, a</w:t>
+      </w:r>
+      <w:r>
+        <w:t>nd Firebase.</w:t>
       </w:r>
     </w:p>
     <w:p>
@@ -338,7 +243,7 @@
         <w:pBdr>
           <w:bottom w:val="single" w:sz="8" w:space="4" w:color="1A5276"/>
         </w:pBdr>
-        <w:spacing w:before="200" w:after="60"/>
+        <w:spacing w:before="160" w:after="40" w:line="252" w:lineRule="auto"/>
       </w:pPr>
       <w:r>
         <w:rPr>
@@ -385,7 +290,7 @@
           </w:tcPr>
           <w:p>
             <w:pPr>
-              <w:spacing w:before="100" w:after="20"/>
+              <w:spacing w:after="20" w:line="252" w:lineRule="auto"/>
             </w:pPr>
             <w:r>
               <w:rPr>
@@ -399,7 +304,7 @@
           </w:p>
           <w:p>
             <w:pPr>
-              <w:spacing w:after="60"/>
+              <w:spacing w:after="20" w:line="252" w:lineRule="auto"/>
             </w:pPr>
             <w:r>
               <w:rPr>
@@ -424,7 +329,7 @@
           </w:tcPr>
           <w:p>
             <w:pPr>
-              <w:spacing w:before="100"/>
+              <w:spacing w:after="20" w:line="252" w:lineRule="auto"/>
               <w:jc w:val="right"/>
             </w:pPr>
             <w:r>
@@ -438,6 +343,7 @@
           </w:p>
           <w:p>
             <w:pPr>
+              <w:spacing w:after="20" w:line="252" w:lineRule="auto"/>
               <w:jc w:val="right"/>
             </w:pPr>
             <w:r>
@@ -454,92 +360,102 @@
     </w:tbl>
     <w:p>
       <w:pPr>
-        <w:spacing w:before="40" w:after="40"/>
-      </w:pPr>
-      <w:proofErr w:type="gramStart"/>
-      <w:r>
-        <w:rPr>
-          <w:b/>
-          <w:bCs/>
-          <w:color w:val="1A5276"/>
-        </w:rPr>
-        <w:t xml:space="preserve">▸  </w:t>
+        <w:spacing w:before="20" w:after="20" w:line="252" w:lineRule="auto"/>
+      </w:pPr>
+      <w:r>
+        <w:rPr>
+          <w:b/>
+          <w:bCs/>
+          <w:color w:val="1A5276"/>
+        </w:rPr>
+        <w:t>▸</w:t>
+      </w:r>
+      <w:r>
+        <w:rPr>
+          <w:b/>
+          <w:bCs/>
+          <w:color w:val="1A5276"/>
+        </w:rPr>
+        <w:t xml:space="preserve">  </w:t>
       </w:r>
       <w:r>
         <w:t>Developing</w:t>
       </w:r>
-      <w:proofErr w:type="gramEnd"/>
       <w:r>
         <w:t xml:space="preserve"> AI-integrated web tools that automate content workflows and reduce manual processing overhead for RAD InfoTech's digital platforms</w:t>
       </w:r>
     </w:p>
     <w:p>
       <w:pPr>
-        <w:spacing w:before="40" w:after="40"/>
-      </w:pPr>
-      <w:proofErr w:type="gramStart"/>
-      <w:r>
-        <w:rPr>
-          <w:b/>
-          <w:bCs/>
-          <w:color w:val="1A5276"/>
-        </w:rPr>
-        <w:t xml:space="preserve">▸  </w:t>
-      </w:r>
-      <w:r>
-        <w:t>Building</w:t>
-      </w:r>
-      <w:proofErr w:type="gramEnd"/>
-      <w:r>
-        <w:t xml:space="preserve"> and deploying full-stack features using React.js, Node.js, and MongoDB in an active production environment</w:t>
-      </w:r>
-    </w:p>
-    <w:p>
-      <w:pPr>
-        <w:spacing w:before="40" w:after="40"/>
-      </w:pPr>
-      <w:proofErr w:type="gramStart"/>
-      <w:r>
-        <w:rPr>
-          <w:b/>
-          <w:bCs/>
-          <w:color w:val="1A5276"/>
-        </w:rPr>
-        <w:t xml:space="preserve">▸  </w:t>
-      </w:r>
-      <w:r>
-        <w:t>Implementing</w:t>
-      </w:r>
-      <w:proofErr w:type="gramEnd"/>
-      <w:r>
-        <w:t xml:space="preserve"> REST APIs and cloud-based microservices, contributing to platform scalability and performance</w:t>
-      </w:r>
-    </w:p>
-    <w:p>
-      <w:pPr>
-        <w:spacing w:before="40" w:after="40"/>
-      </w:pPr>
-      <w:proofErr w:type="gramStart"/>
-      <w:r>
-        <w:rPr>
-          <w:b/>
-          <w:bCs/>
-          <w:color w:val="1A5276"/>
-        </w:rPr>
-        <w:t xml:space="preserve">▸  </w:t>
-      </w:r>
-      <w:r>
-        <w:t>Collaborating</w:t>
-      </w:r>
-      <w:proofErr w:type="gramEnd"/>
-      <w:r>
-        <w:t xml:space="preserve"> in an agile team; performance, skills, and adaptability assessed for full-time consideration upon internship completion</w:t>
-      </w:r>
-    </w:p>
-    <w:p>
-      <w:pPr>
-        <w:spacing w:after="80"/>
-      </w:pPr>
+        <w:spacing w:before="20" w:after="20" w:line="252" w:lineRule="auto"/>
+      </w:pPr>
+      <w:r>
+        <w:rPr>
+          <w:b/>
+          <w:bCs/>
+          <w:color w:val="1A5276"/>
+        </w:rPr>
+        <w:t>▸</w:t>
+      </w:r>
+      <w:r>
+        <w:rPr>
+          <w:b/>
+          <w:bCs/>
+          <w:color w:val="1A5276"/>
+        </w:rPr>
+        <w:t xml:space="preserve">  </w:t>
+      </w:r>
+      <w:r>
+        <w:t>Building and deploying full-stack features using React.js, Node.js, and MongoDB in an active production environment</w:t>
+      </w:r>
+    </w:p>
+    <w:p>
+      <w:pPr>
+        <w:spacing w:before="20" w:after="20" w:line="252" w:lineRule="auto"/>
+      </w:pPr>
+      <w:r>
+        <w:rPr>
+          <w:b/>
+          <w:bCs/>
+          <w:color w:val="1A5276"/>
+        </w:rPr>
+        <w:t>▸</w:t>
+      </w:r>
+      <w:r>
+        <w:rPr>
+          <w:b/>
+          <w:bCs/>
+          <w:color w:val="1A5276"/>
+        </w:rPr>
+        <w:t xml:space="preserve">  </w:t>
+      </w:r>
+      <w:r>
+        <w:t>Implementing REST APIs and cloud-based microservices, contributing to platform scalability and performance</w:t>
+      </w:r>
+    </w:p>
+    <w:p>
+      <w:pPr>
+        <w:spacing w:before="20" w:after="20" w:line="252" w:lineRule="auto"/>
+      </w:pPr>
+      <w:r>
+        <w:rPr>
+          <w:b/>
+          <w:bCs/>
+          <w:color w:val="1A5276"/>
+        </w:rPr>
+        <w:t>▸</w:t>
+      </w:r>
+      <w:r>
+        <w:rPr>
+          <w:b/>
+          <w:bCs/>
+          <w:color w:val="1A5276"/>
+        </w:rPr>
+        <w:t xml:space="preserve">  </w:t>
+      </w:r>
+      <w:r>
+        <w:t>Collaborating in an agile team; performance, skills, and adaptability assessed for full-time consideration upon internship completion</w:t>
+      </w:r>
     </w:p>
     <w:tbl>
       <w:tblPr>
@@ -575,7 +491,7 @@
           </w:tcPr>
           <w:p>
             <w:pPr>
-              <w:spacing w:before="100" w:after="20"/>
+              <w:spacing w:after="20" w:line="252" w:lineRule="auto"/>
             </w:pPr>
             <w:r>
               <w:rPr>
@@ -589,25 +505,15 @@
           </w:p>
           <w:p>
             <w:pPr>
-              <w:spacing w:after="60"/>
-            </w:pPr>
-            <w:proofErr w:type="spellStart"/>
+              <w:spacing w:after="20" w:line="252" w:lineRule="auto"/>
+            </w:pPr>
             <w:r>
               <w:rPr>
                 <w:b/>
                 <w:bCs/>
                 <w:color w:val="1A5276"/>
               </w:rPr>
-              <w:t>Shevara</w:t>
-            </w:r>
-            <w:proofErr w:type="spellEnd"/>
-            <w:r>
-              <w:rPr>
-                <w:b/>
-                <w:bCs/>
-                <w:color w:val="1A5276"/>
-              </w:rPr>
-              <w:t xml:space="preserve"> Nexus</w:t>
+              <w:t>Shevara Nexus</w:t>
             </w:r>
           </w:p>
         </w:tc>
@@ -624,7 +530,7 @@
           </w:tcPr>
           <w:p>
             <w:pPr>
-              <w:spacing w:before="100"/>
+              <w:spacing w:after="20" w:line="252" w:lineRule="auto"/>
               <w:jc w:val="right"/>
             </w:pPr>
             <w:r>
@@ -638,6 +544,7 @@
           </w:p>
           <w:p>
             <w:pPr>
+              <w:spacing w:after="20" w:line="252" w:lineRule="auto"/>
               <w:jc w:val="right"/>
             </w:pPr>
             <w:r>
@@ -654,65 +561,77 @@
     </w:tbl>
     <w:p>
       <w:pPr>
-        <w:spacing w:before="40" w:after="40"/>
-      </w:pPr>
-      <w:proofErr w:type="gramStart"/>
-      <w:r>
-        <w:rPr>
-          <w:b/>
-          <w:bCs/>
-          <w:color w:val="1A5276"/>
-        </w:rPr>
-        <w:t xml:space="preserve">▸  </w:t>
-      </w:r>
-      <w:r>
-        <w:t>Conceptualizing</w:t>
-      </w:r>
-      <w:proofErr w:type="gramEnd"/>
-      <w:r>
-        <w:t xml:space="preserve"> and building AI-powered software products targeting EdTech and productivity markets</w:t>
-      </w:r>
-    </w:p>
-    <w:p>
-      <w:pPr>
-        <w:spacing w:before="40" w:after="40"/>
-      </w:pPr>
-      <w:proofErr w:type="gramStart"/>
-      <w:r>
-        <w:rPr>
-          <w:b/>
-          <w:bCs/>
-          <w:color w:val="1A5276"/>
-        </w:rPr>
-        <w:t xml:space="preserve">▸  </w:t>
+        <w:spacing w:before="20" w:after="20" w:line="252" w:lineRule="auto"/>
+      </w:pPr>
+      <w:r>
+        <w:rPr>
+          <w:b/>
+          <w:bCs/>
+          <w:color w:val="1A5276"/>
+        </w:rPr>
+        <w:t>▸</w:t>
+      </w:r>
+      <w:r>
+        <w:rPr>
+          <w:b/>
+          <w:bCs/>
+          <w:color w:val="1A5276"/>
+        </w:rPr>
+        <w:t xml:space="preserve">  </w:t>
+      </w:r>
+      <w:r>
+        <w:t>Conceptualizing and building AI-powered software products targeting EdTech and productivity markets</w:t>
+      </w:r>
+    </w:p>
+    <w:p>
+      <w:pPr>
+        <w:spacing w:before="20" w:after="20" w:line="252" w:lineRule="auto"/>
+      </w:pPr>
+      <w:r>
+        <w:rPr>
+          <w:b/>
+          <w:bCs/>
+          <w:color w:val="1A5276"/>
+        </w:rPr>
+        <w:t>▸</w:t>
+      </w:r>
+      <w:r>
+        <w:rPr>
+          <w:b/>
+          <w:bCs/>
+          <w:color w:val="1A5276"/>
+        </w:rPr>
+        <w:t xml:space="preserve">  </w:t>
       </w:r>
       <w:r>
         <w:t>Leading</w:t>
       </w:r>
-      <w:proofErr w:type="gramEnd"/>
       <w:r>
         <w:t xml:space="preserve"> end-to-end product development: ideation, full-stack engineering, UI/UX design, and go-to-market strategy</w:t>
       </w:r>
     </w:p>
     <w:p>
       <w:pPr>
-        <w:spacing w:before="40" w:after="40"/>
-      </w:pPr>
-      <w:proofErr w:type="gramStart"/>
-      <w:r>
-        <w:rPr>
-          <w:b/>
-          <w:bCs/>
-          <w:color w:val="1A5276"/>
-        </w:rPr>
-        <w:t xml:space="preserve">▸  </w:t>
-      </w:r>
-      <w:r>
-        <w:t>Managing</w:t>
-      </w:r>
-      <w:proofErr w:type="gramEnd"/>
-      <w:r>
-        <w:t xml:space="preserve"> product roadmap and technical architecture independently as a solo founder</w:t>
+        <w:spacing w:before="20" w:after="20" w:line="252" w:lineRule="auto"/>
+      </w:pPr>
+      <w:r>
+        <w:rPr>
+          <w:b/>
+          <w:bCs/>
+          <w:color w:val="1A5276"/>
+        </w:rPr>
+        <w:t>▸</w:t>
+      </w:r>
+      <w:r>
+        <w:rPr>
+          <w:b/>
+          <w:bCs/>
+          <w:color w:val="1A5276"/>
+        </w:rPr>
+        <w:t xml:space="preserve">  </w:t>
+      </w:r>
+      <w:r>
+        <w:t>Managing product roadmap and technical architecture independently as a solo founder</w:t>
       </w:r>
     </w:p>
     <w:p>
@@ -720,7 +639,7 @@
         <w:pBdr>
           <w:bottom w:val="single" w:sz="8" w:space="4" w:color="1A5276"/>
         </w:pBdr>
-        <w:spacing w:before="200" w:after="60"/>
+        <w:spacing w:before="160" w:after="40" w:line="252" w:lineRule="auto"/>
       </w:pPr>
       <w:r>
         <w:rPr>
@@ -767,7 +686,7 @@
           </w:tcPr>
           <w:p>
             <w:pPr>
-              <w:spacing w:before="100" w:after="20"/>
+              <w:spacing w:after="20" w:line="252" w:lineRule="auto"/>
             </w:pPr>
             <w:r>
               <w:rPr>
@@ -793,7 +712,7 @@
           </w:tcPr>
           <w:p>
             <w:pPr>
-              <w:spacing w:before="100" w:after="20"/>
+              <w:spacing w:after="20" w:line="252" w:lineRule="auto"/>
               <w:jc w:val="right"/>
             </w:pPr>
             <w:r>
@@ -812,58 +731,51 @@
     </w:tbl>
     <w:p>
       <w:pPr>
-        <w:spacing w:before="40" w:after="40"/>
-      </w:pPr>
-      <w:proofErr w:type="gramStart"/>
-      <w:r>
-        <w:rPr>
-          <w:b/>
-          <w:bCs/>
-          <w:color w:val="1A5276"/>
-        </w:rPr>
-        <w:t xml:space="preserve">▸  </w:t>
-      </w:r>
-      <w:r>
-        <w:t>Built</w:t>
-      </w:r>
-      <w:proofErr w:type="gramEnd"/>
-      <w:r>
-        <w:t xml:space="preserve"> an intelligent web app that parses </w:t>
-      </w:r>
-      <w:proofErr w:type="gramStart"/>
-      <w:r>
-        <w:t>resumes</w:t>
-      </w:r>
-      <w:proofErr w:type="gramEnd"/>
-      <w:r>
-        <w:t xml:space="preserve"> using AI/NLP and provides real-time ATS compatibility feedback and improvement suggestions</w:t>
-      </w:r>
-    </w:p>
-    <w:p>
-      <w:pPr>
-        <w:spacing w:before="40" w:after="40"/>
-      </w:pPr>
-      <w:proofErr w:type="gramStart"/>
-      <w:r>
-        <w:rPr>
-          <w:b/>
-          <w:bCs/>
-          <w:color w:val="1A5276"/>
-        </w:rPr>
-        <w:t xml:space="preserve">▸  </w:t>
-      </w:r>
-      <w:r>
-        <w:t>Implemented</w:t>
-      </w:r>
-      <w:proofErr w:type="gramEnd"/>
-      <w:r>
-        <w:t xml:space="preserve"> automated scoring logic evaluating content quality, keyword density, and formatting against recruiter benchmarks</w:t>
-      </w:r>
-    </w:p>
-    <w:p>
-      <w:pPr>
-        <w:spacing w:after="80"/>
-      </w:pPr>
+        <w:spacing w:before="20" w:after="20" w:line="252" w:lineRule="auto"/>
+      </w:pPr>
+      <w:r>
+        <w:rPr>
+          <w:b/>
+          <w:bCs/>
+          <w:color w:val="1A5276"/>
+        </w:rPr>
+        <w:t>▸</w:t>
+      </w:r>
+      <w:r>
+        <w:rPr>
+          <w:b/>
+          <w:bCs/>
+          <w:color w:val="1A5276"/>
+        </w:rPr>
+        <w:t xml:space="preserve">  </w:t>
+      </w:r>
+      <w:r>
+        <w:t>Built an intelligent web app that parses resumes using AI/NLP and provides real-time ATS compatibility feedback and improvement suggestions</w:t>
+      </w:r>
+    </w:p>
+    <w:p>
+      <w:pPr>
+        <w:spacing w:before="20" w:after="20" w:line="252" w:lineRule="auto"/>
+      </w:pPr>
+      <w:r>
+        <w:rPr>
+          <w:b/>
+          <w:bCs/>
+          <w:color w:val="1A5276"/>
+        </w:rPr>
+        <w:t>▸</w:t>
+      </w:r>
+      <w:r>
+        <w:rPr>
+          <w:b/>
+          <w:bCs/>
+          <w:color w:val="1A5276"/>
+        </w:rPr>
+        <w:t xml:space="preserve">  </w:t>
+      </w:r>
+      <w:r>
+        <w:t>Implemented automated scoring logic evaluating content quality, keyword density, and formatting against recruiter benchmarks</w:t>
+      </w:r>
     </w:p>
     <w:tbl>
       <w:tblPr>
@@ -899,7 +811,7 @@
           </w:tcPr>
           <w:p>
             <w:pPr>
-              <w:spacing w:before="100" w:after="20"/>
+              <w:spacing w:after="20" w:line="252" w:lineRule="auto"/>
             </w:pPr>
             <w:r>
               <w:rPr>
@@ -925,7 +837,7 @@
           </w:tcPr>
           <w:p>
             <w:pPr>
-              <w:spacing w:before="100" w:after="20"/>
+              <w:spacing w:after="20" w:line="252" w:lineRule="auto"/>
               <w:jc w:val="right"/>
             </w:pPr>
             <w:r>
@@ -944,50 +856,51 @@
     </w:tbl>
     <w:p>
       <w:pPr>
-        <w:spacing w:before="40" w:after="40"/>
-      </w:pPr>
-      <w:proofErr w:type="gramStart"/>
-      <w:r>
-        <w:rPr>
-          <w:b/>
-          <w:bCs/>
-          <w:color w:val="1A5276"/>
-        </w:rPr>
-        <w:t xml:space="preserve">▸  </w:t>
-      </w:r>
-      <w:r>
-        <w:t>Developed</w:t>
-      </w:r>
-      <w:proofErr w:type="gramEnd"/>
-      <w:r>
-        <w:t xml:space="preserve"> an AI-driven platform simulating technical and behavioural interviews, delivering structured feedback on candidate responses</w:t>
-      </w:r>
-    </w:p>
-    <w:p>
-      <w:pPr>
-        <w:spacing w:before="40" w:after="40"/>
-      </w:pPr>
-      <w:proofErr w:type="gramStart"/>
-      <w:r>
-        <w:rPr>
-          <w:b/>
-          <w:bCs/>
-          <w:color w:val="1A5276"/>
-        </w:rPr>
-        <w:t xml:space="preserve">▸  </w:t>
-      </w:r>
-      <w:r>
-        <w:t>Designed</w:t>
-      </w:r>
-      <w:proofErr w:type="gramEnd"/>
-      <w:r>
-        <w:t xml:space="preserve"> adaptive question banks and real-time scoring for software engineering and aptitude domains</w:t>
-      </w:r>
-    </w:p>
-    <w:p>
-      <w:pPr>
-        <w:spacing w:after="80"/>
-      </w:pPr>
+        <w:spacing w:before="20" w:after="20" w:line="252" w:lineRule="auto"/>
+      </w:pPr>
+      <w:r>
+        <w:rPr>
+          <w:b/>
+          <w:bCs/>
+          <w:color w:val="1A5276"/>
+        </w:rPr>
+        <w:t>▸</w:t>
+      </w:r>
+      <w:r>
+        <w:rPr>
+          <w:b/>
+          <w:bCs/>
+          <w:color w:val="1A5276"/>
+        </w:rPr>
+        <w:t xml:space="preserve">  </w:t>
+      </w:r>
+      <w:r>
+        <w:t>Developed an AI-driven platform simulating technical and behavioural interviews, delivering structured feedback on candidate responses</w:t>
+      </w:r>
+    </w:p>
+    <w:p>
+      <w:pPr>
+        <w:spacing w:before="20" w:after="20" w:line="252" w:lineRule="auto"/>
+      </w:pPr>
+      <w:r>
+        <w:rPr>
+          <w:b/>
+          <w:bCs/>
+          <w:color w:val="1A5276"/>
+        </w:rPr>
+        <w:t>▸</w:t>
+      </w:r>
+      <w:r>
+        <w:rPr>
+          <w:b/>
+          <w:bCs/>
+          <w:color w:val="1A5276"/>
+        </w:rPr>
+        <w:t xml:space="preserve">  </w:t>
+      </w:r>
+      <w:r>
+        <w:t>Designed adaptive question banks and real-time scoring for software engineering and aptitude domains</w:t>
+      </w:r>
     </w:p>
     <w:tbl>
       <w:tblPr>
@@ -1023,7 +936,7 @@
           </w:tcPr>
           <w:p>
             <w:pPr>
-              <w:spacing w:before="100" w:after="20"/>
+              <w:spacing w:after="20" w:line="252" w:lineRule="auto"/>
             </w:pPr>
             <w:r>
               <w:rPr>
@@ -1049,7 +962,7 @@
           </w:tcPr>
           <w:p>
             <w:pPr>
-              <w:spacing w:before="100" w:after="20"/>
+              <w:spacing w:after="20" w:line="252" w:lineRule="auto"/>
               <w:jc w:val="right"/>
             </w:pPr>
             <w:r>
@@ -1068,59 +981,51 @@
     </w:tbl>
     <w:p>
       <w:pPr>
-        <w:spacing w:before="40" w:after="40"/>
-      </w:pPr>
-      <w:proofErr w:type="gramStart"/>
-      <w:r>
-        <w:rPr>
-          <w:b/>
-          <w:bCs/>
-          <w:color w:val="1A5276"/>
-        </w:rPr>
-        <w:t xml:space="preserve">▸  </w:t>
-      </w:r>
-      <w:r>
-        <w:t>Built</w:t>
-      </w:r>
-      <w:proofErr w:type="gramEnd"/>
-      <w:r>
-        <w:t xml:space="preserve"> a full-featured Learning Management System supporting course creation, student </w:t>
-      </w:r>
-      <w:proofErr w:type="spellStart"/>
-      <w:r>
-        <w:t>enrollment</w:t>
-      </w:r>
-      <w:proofErr w:type="spellEnd"/>
-      <w:r>
-        <w:t>, assignment submission, and progress tracking</w:t>
-      </w:r>
-    </w:p>
-    <w:p>
-      <w:pPr>
-        <w:spacing w:before="40" w:after="40"/>
-      </w:pPr>
-      <w:proofErr w:type="gramStart"/>
-      <w:r>
-        <w:rPr>
-          <w:b/>
-          <w:bCs/>
-          <w:color w:val="1A5276"/>
-        </w:rPr>
-        <w:lastRenderedPageBreak/>
-        <w:t xml:space="preserve">▸  </w:t>
-      </w:r>
-      <w:r>
-        <w:t>Implemented</w:t>
-      </w:r>
-      <w:proofErr w:type="gramEnd"/>
-      <w:r>
-        <w:t xml:space="preserve"> role-based access control (admin, instructor, student) with secure authentication and real-time dashboard</w:t>
-      </w:r>
-    </w:p>
-    <w:p>
-      <w:pPr>
-        <w:spacing w:after="80"/>
-      </w:pPr>
+        <w:spacing w:before="20" w:after="20" w:line="252" w:lineRule="auto"/>
+      </w:pPr>
+      <w:r>
+        <w:rPr>
+          <w:b/>
+          <w:bCs/>
+          <w:color w:val="1A5276"/>
+        </w:rPr>
+        <w:t>▸</w:t>
+      </w:r>
+      <w:r>
+        <w:rPr>
+          <w:b/>
+          <w:bCs/>
+          <w:color w:val="1A5276"/>
+        </w:rPr>
+        <w:t xml:space="preserve">  </w:t>
+      </w:r>
+      <w:r>
+        <w:t>Built a full-featured Learning Management System supporting course creation, student enrollment, assignment submission, and progress tracking</w:t>
+      </w:r>
+    </w:p>
+    <w:p>
+      <w:pPr>
+        <w:spacing w:before="20" w:after="20" w:line="252" w:lineRule="auto"/>
+      </w:pPr>
+      <w:r>
+        <w:rPr>
+          <w:b/>
+          <w:bCs/>
+          <w:color w:val="1A5276"/>
+        </w:rPr>
+        <w:t>▸</w:t>
+      </w:r>
+      <w:r>
+        <w:rPr>
+          <w:b/>
+          <w:bCs/>
+          <w:color w:val="1A5276"/>
+        </w:rPr>
+        <w:t xml:space="preserve">  </w:t>
+      </w:r>
+      <w:r>
+        <w:t>Implemented role-based access control (admin, instructor, student) with secure authentication and real-time dashboard</w:t>
+      </w:r>
     </w:p>
     <w:tbl>
       <w:tblPr>
@@ -1156,7 +1061,7 @@
           </w:tcPr>
           <w:p>
             <w:pPr>
-              <w:spacing w:before="100" w:after="20"/>
+              <w:spacing w:after="20" w:line="252" w:lineRule="auto"/>
             </w:pPr>
             <w:r>
               <w:rPr>
@@ -1182,7 +1087,7 @@
           </w:tcPr>
           <w:p>
             <w:pPr>
-              <w:spacing w:before="100" w:after="20"/>
+              <w:spacing w:after="20" w:line="252" w:lineRule="auto"/>
               <w:jc w:val="right"/>
             </w:pPr>
             <w:r>
@@ -1201,50 +1106,51 @@
     </w:tbl>
     <w:p>
       <w:pPr>
-        <w:spacing w:before="40" w:after="40"/>
-      </w:pPr>
-      <w:proofErr w:type="gramStart"/>
-      <w:r>
-        <w:rPr>
-          <w:b/>
-          <w:bCs/>
-          <w:color w:val="1A5276"/>
-        </w:rPr>
-        <w:t xml:space="preserve">▸  </w:t>
-      </w:r>
-      <w:r>
-        <w:t>Designed</w:t>
-      </w:r>
-      <w:proofErr w:type="gramEnd"/>
-      <w:r>
-        <w:t xml:space="preserve"> a tamper-proof digital certificate issuance and verification system with unique ID-based validation, eliminating credential fraud</w:t>
-      </w:r>
-    </w:p>
-    <w:p>
-      <w:pPr>
-        <w:spacing w:before="40" w:after="40"/>
-      </w:pPr>
-      <w:proofErr w:type="gramStart"/>
-      <w:r>
-        <w:rPr>
-          <w:b/>
-          <w:bCs/>
-          <w:color w:val="1A5276"/>
-        </w:rPr>
-        <w:t xml:space="preserve">▸  </w:t>
-      </w:r>
-      <w:r>
-        <w:t>Built</w:t>
-      </w:r>
-      <w:proofErr w:type="gramEnd"/>
-      <w:r>
-        <w:t xml:space="preserve"> an admin portal for batch certificate generation and a public-facing verification interface</w:t>
-      </w:r>
-    </w:p>
-    <w:p>
-      <w:pPr>
-        <w:spacing w:after="80"/>
-      </w:pPr>
+        <w:spacing w:before="20" w:after="20" w:line="252" w:lineRule="auto"/>
+      </w:pPr>
+      <w:r>
+        <w:rPr>
+          <w:b/>
+          <w:bCs/>
+          <w:color w:val="1A5276"/>
+        </w:rPr>
+        <w:t>▸</w:t>
+      </w:r>
+      <w:r>
+        <w:rPr>
+          <w:b/>
+          <w:bCs/>
+          <w:color w:val="1A5276"/>
+        </w:rPr>
+        <w:t xml:space="preserve">  </w:t>
+      </w:r>
+      <w:r>
+        <w:t>Designed a tamper-proof digital certificate issuance and verification system with unique ID-based validation, eliminating credential fraud</w:t>
+      </w:r>
+    </w:p>
+    <w:p>
+      <w:pPr>
+        <w:spacing w:before="20" w:after="20" w:line="252" w:lineRule="auto"/>
+      </w:pPr>
+      <w:r>
+        <w:rPr>
+          <w:b/>
+          <w:bCs/>
+          <w:color w:val="1A5276"/>
+        </w:rPr>
+        <w:t>▸</w:t>
+      </w:r>
+      <w:r>
+        <w:rPr>
+          <w:b/>
+          <w:bCs/>
+          <w:color w:val="1A5276"/>
+        </w:rPr>
+        <w:t xml:space="preserve">  </w:t>
+      </w:r>
+      <w:r>
+        <w:t>Built an admin portal for batch certificate generation and a public-facing verification interface</w:t>
+      </w:r>
     </w:p>
     <w:tbl>
       <w:tblPr>
@@ -1280,7 +1186,7 @@
           </w:tcPr>
           <w:p>
             <w:pPr>
-              <w:spacing w:before="100" w:after="20"/>
+              <w:spacing w:after="20" w:line="252" w:lineRule="auto"/>
             </w:pPr>
             <w:r>
               <w:rPr>
@@ -1306,7 +1212,7 @@
           </w:tcPr>
           <w:p>
             <w:pPr>
-              <w:spacing w:before="100" w:after="20"/>
+              <w:spacing w:after="20" w:line="252" w:lineRule="auto"/>
               <w:jc w:val="right"/>
             </w:pPr>
             <w:r>
@@ -1325,44 +1231,50 @@
     </w:tbl>
     <w:p>
       <w:pPr>
-        <w:spacing w:before="40" w:after="40"/>
-      </w:pPr>
-      <w:proofErr w:type="gramStart"/>
-      <w:r>
-        <w:rPr>
-          <w:b/>
-          <w:bCs/>
-          <w:color w:val="1A5276"/>
-        </w:rPr>
-        <w:t xml:space="preserve">▸  </w:t>
-      </w:r>
-      <w:r>
-        <w:t>Created</w:t>
-      </w:r>
-      <w:proofErr w:type="gramEnd"/>
-      <w:r>
-        <w:t xml:space="preserve"> a real-time analytics dashboard tracking academic performance, attendance, CGPA trends, and assignment deadlines</w:t>
-      </w:r>
-    </w:p>
-    <w:p>
-      <w:pPr>
-        <w:spacing w:before="40" w:after="40"/>
-      </w:pPr>
-      <w:proofErr w:type="gramStart"/>
-      <w:r>
-        <w:rPr>
-          <w:b/>
-          <w:bCs/>
-          <w:color w:val="1A5276"/>
-        </w:rPr>
-        <w:t xml:space="preserve">▸  </w:t>
-      </w:r>
-      <w:r>
-        <w:t>Integrated</w:t>
-      </w:r>
-      <w:proofErr w:type="gramEnd"/>
-      <w:r>
-        <w:t xml:space="preserve"> live data sync via Firebase with role-based views for students and faculty</w:t>
+        <w:spacing w:before="20" w:after="20" w:line="252" w:lineRule="auto"/>
+      </w:pPr>
+      <w:r>
+        <w:rPr>
+          <w:b/>
+          <w:bCs/>
+          <w:color w:val="1A5276"/>
+        </w:rPr>
+        <w:t>▸</w:t>
+      </w:r>
+      <w:r>
+        <w:rPr>
+          <w:b/>
+          <w:bCs/>
+          <w:color w:val="1A5276"/>
+        </w:rPr>
+        <w:t xml:space="preserve">  </w:t>
+      </w:r>
+      <w:r>
+        <w:t>Created a real-time analytics dashboard tracking academic performance, attendance, CGPA trends, and assignment deadlines</w:t>
+      </w:r>
+    </w:p>
+    <w:p>
+      <w:pPr>
+        <w:spacing w:before="20" w:after="20" w:line="252" w:lineRule="auto"/>
+      </w:pPr>
+      <w:r>
+        <w:rPr>
+          <w:b/>
+          <w:bCs/>
+          <w:color w:val="1A5276"/>
+        </w:rPr>
+        <w:t>▸</w:t>
+      </w:r>
+      <w:r>
+        <w:rPr>
+          <w:b/>
+          <w:bCs/>
+          <w:color w:val="1A5276"/>
+        </w:rPr>
+        <w:t xml:space="preserve">  </w:t>
+      </w:r>
+      <w:r>
+        <w:t>Integrated live data sync via Firebase with role-based views for students and faculty</w:t>
       </w:r>
     </w:p>
     <w:p>
@@ -1370,7 +1282,7 @@
         <w:pBdr>
           <w:bottom w:val="single" w:sz="8" w:space="4" w:color="1A5276"/>
         </w:pBdr>
-        <w:spacing w:before="200" w:after="60"/>
+        <w:spacing w:before="160" w:after="40" w:line="252" w:lineRule="auto"/>
       </w:pPr>
       <w:r>
         <w:rPr>
@@ -1380,6 +1292,7 @@
           <w:sz w:val="22"/>
           <w:szCs w:val="22"/>
         </w:rPr>
+        <w:lastRenderedPageBreak/>
         <w:t>TECHNICAL SKILLS</w:t>
       </w:r>
     </w:p>
@@ -1422,6 +1335,9 @@
             </w:tcMar>
           </w:tcPr>
           <w:p>
+            <w:pPr>
+              <w:spacing w:after="20" w:line="252" w:lineRule="auto"/>
+            </w:pPr>
             <w:r>
               <w:rPr>
                 <w:b/>
@@ -1451,6 +1367,9 @@
             </w:tcMar>
           </w:tcPr>
           <w:p>
+            <w:pPr>
+              <w:spacing w:after="20" w:line="252" w:lineRule="auto"/>
+            </w:pPr>
             <w:r>
               <w:rPr>
                 <w:sz w:val="19"/>
@@ -1479,6 +1398,9 @@
             </w:tcMar>
           </w:tcPr>
           <w:p>
+            <w:pPr>
+              <w:spacing w:after="20" w:line="252" w:lineRule="auto"/>
+            </w:pPr>
             <w:r>
               <w:rPr>
                 <w:b/>
@@ -1508,6 +1430,9 @@
             </w:tcMar>
           </w:tcPr>
           <w:p>
+            <w:pPr>
+              <w:spacing w:after="20" w:line="252" w:lineRule="auto"/>
+            </w:pPr>
             <w:r>
               <w:rPr>
                 <w:sz w:val="19"/>
@@ -1536,6 +1461,9 @@
             </w:tcMar>
           </w:tcPr>
           <w:p>
+            <w:pPr>
+              <w:spacing w:after="20" w:line="252" w:lineRule="auto"/>
+            </w:pPr>
             <w:r>
               <w:rPr>
                 <w:b/>
@@ -1565,6 +1493,9 @@
             </w:tcMar>
           </w:tcPr>
           <w:p>
+            <w:pPr>
+              <w:spacing w:after="20" w:line="252" w:lineRule="auto"/>
+            </w:pPr>
             <w:r>
               <w:rPr>
                 <w:sz w:val="19"/>
@@ -1593,6 +1524,9 @@
             </w:tcMar>
           </w:tcPr>
           <w:p>
+            <w:pPr>
+              <w:spacing w:after="20" w:line="252" w:lineRule="auto"/>
+            </w:pPr>
             <w:r>
               <w:rPr>
                 <w:b/>
@@ -1622,22 +1556,16 @@
             </w:tcMar>
           </w:tcPr>
           <w:p>
+            <w:pPr>
+              <w:spacing w:after="20" w:line="252" w:lineRule="auto"/>
+            </w:pPr>
             <w:r>
               <w:rPr>
                 <w:sz w:val="19"/>
                 <w:szCs w:val="19"/>
               </w:rPr>
-              <w:t xml:space="preserve">MongoDB, MySQL, Firebase </w:t>
-            </w:r>
-            <w:proofErr w:type="spellStart"/>
-            <w:r>
-              <w:rPr>
-                <w:sz w:val="19"/>
-                <w:szCs w:val="19"/>
-              </w:rPr>
-              <w:t>Firestore</w:t>
-            </w:r>
-            <w:proofErr w:type="spellEnd"/>
+              <w:t>MongoDB, MySQL, Firebase Firestore</w:t>
+            </w:r>
           </w:p>
         </w:tc>
       </w:tr>
@@ -1659,6 +1587,9 @@
             </w:tcMar>
           </w:tcPr>
           <w:p>
+            <w:pPr>
+              <w:spacing w:after="20" w:line="252" w:lineRule="auto"/>
+            </w:pPr>
             <w:r>
               <w:rPr>
                 <w:b/>
@@ -1688,22 +1619,16 @@
             </w:tcMar>
           </w:tcPr>
           <w:p>
+            <w:pPr>
+              <w:spacing w:after="20" w:line="252" w:lineRule="auto"/>
+            </w:pPr>
             <w:r>
               <w:rPr>
                 <w:sz w:val="19"/>
                 <w:szCs w:val="19"/>
               </w:rPr>
-              <w:t xml:space="preserve">Cloud Computing, Git, GitHub, VS Code, </w:t>
-            </w:r>
-            <w:proofErr w:type="spellStart"/>
-            <w:r>
-              <w:rPr>
-                <w:sz w:val="19"/>
-                <w:szCs w:val="19"/>
-              </w:rPr>
-              <w:t>Vercel</w:t>
-            </w:r>
-            <w:proofErr w:type="spellEnd"/>
+              <w:t>Cloud Computing, Git, GitHub, VS Code, Vercel</w:t>
+            </w:r>
           </w:p>
         </w:tc>
       </w:tr>
@@ -1725,6 +1650,9 @@
             </w:tcMar>
           </w:tcPr>
           <w:p>
+            <w:pPr>
+              <w:spacing w:after="20" w:line="252" w:lineRule="auto"/>
+            </w:pPr>
             <w:r>
               <w:rPr>
                 <w:b/>
@@ -1754,6 +1682,9 @@
             </w:tcMar>
           </w:tcPr>
           <w:p>
+            <w:pPr>
+              <w:spacing w:after="20" w:line="252" w:lineRule="auto"/>
+            </w:pPr>
             <w:r>
               <w:rPr>
                 <w:sz w:val="19"/>
@@ -1770,7 +1701,7 @@
         <w:pBdr>
           <w:bottom w:val="single" w:sz="8" w:space="4" w:color="1A5276"/>
         </w:pBdr>
-        <w:spacing w:before="200" w:after="60"/>
+        <w:spacing w:before="160" w:after="40" w:line="252" w:lineRule="auto"/>
       </w:pPr>
       <w:r>
         <w:rPr>
@@ -1817,10 +1748,8 @@
           </w:tcPr>
           <w:p>
             <w:pPr>
-              <w:spacing w:before="100" w:after="20"/>
-            </w:pPr>
-            <w:proofErr w:type="spellStart"/>
-            <w:proofErr w:type="gramStart"/>
+              <w:spacing w:after="20" w:line="252" w:lineRule="auto"/>
+            </w:pPr>
             <w:r>
               <w:rPr>
                 <w:b/>
@@ -1828,23 +1757,12 @@
                 <w:sz w:val="22"/>
                 <w:szCs w:val="22"/>
               </w:rPr>
-              <w:t>B.Tech</w:t>
-            </w:r>
-            <w:proofErr w:type="spellEnd"/>
-            <w:proofErr w:type="gramEnd"/>
-            <w:r>
-              <w:rPr>
-                <w:b/>
-                <w:bCs/>
-                <w:sz w:val="22"/>
-                <w:szCs w:val="22"/>
-              </w:rPr>
-              <w:t>, Information Technology</w:t>
-            </w:r>
-          </w:p>
-          <w:p>
-            <w:pPr>
-              <w:spacing w:after="60"/>
+              <w:t>B.Tech, Information Technology</w:t>
+            </w:r>
+          </w:p>
+          <w:p>
+            <w:pPr>
+              <w:spacing w:after="20" w:line="252" w:lineRule="auto"/>
             </w:pPr>
             <w:r>
               <w:rPr>
@@ -1869,7 +1787,7 @@
           </w:tcPr>
           <w:p>
             <w:pPr>
-              <w:spacing w:before="100"/>
+              <w:spacing w:after="20" w:line="252" w:lineRule="auto"/>
               <w:jc w:val="right"/>
             </w:pPr>
             <w:r>
@@ -1883,6 +1801,7 @@
           </w:p>
           <w:p>
             <w:pPr>
+              <w:spacing w:after="20" w:line="252" w:lineRule="auto"/>
               <w:jc w:val="right"/>
             </w:pPr>
             <w:r>
@@ -1899,29 +1818,30 @@
     </w:tbl>
     <w:p>
       <w:pPr>
-        <w:spacing w:before="40" w:after="40"/>
-      </w:pPr>
-      <w:proofErr w:type="gramStart"/>
-      <w:r>
-        <w:rPr>
-          <w:b/>
-          <w:bCs/>
-          <w:color w:val="1A5276"/>
-        </w:rPr>
-        <w:t xml:space="preserve">▸  </w:t>
+        <w:spacing w:before="20" w:after="20" w:line="252" w:lineRule="auto"/>
+      </w:pPr>
+      <w:r>
+        <w:rPr>
+          <w:b/>
+          <w:bCs/>
+          <w:color w:val="1A5276"/>
+        </w:rPr>
+        <w:t>▸</w:t>
+      </w:r>
+      <w:r>
+        <w:rPr>
+          <w:b/>
+          <w:bCs/>
+          <w:color w:val="1A5276"/>
+        </w:rPr>
+        <w:t xml:space="preserve">  </w:t>
       </w:r>
       <w:r>
         <w:t>Active</w:t>
       </w:r>
-      <w:proofErr w:type="gramEnd"/>
       <w:r>
         <w:t xml:space="preserve"> member, ISTE Association — documentation and technical initiatives</w:t>
       </w:r>
-    </w:p>
-    <w:p>
-      <w:pPr>
-        <w:spacing w:after="80"/>
-      </w:pPr>
     </w:p>
     <w:tbl>
       <w:tblPr>
@@ -1957,7 +1877,7 @@
           </w:tcPr>
           <w:p>
             <w:pPr>
-              <w:spacing w:before="100" w:after="20"/>
+              <w:spacing w:after="20" w:line="252" w:lineRule="auto"/>
             </w:pPr>
             <w:r>
               <w:rPr>
@@ -1971,7 +1891,7 @@
           </w:p>
           <w:p>
             <w:pPr>
-              <w:spacing w:after="60"/>
+              <w:spacing w:after="20" w:line="252" w:lineRule="auto"/>
             </w:pPr>
             <w:r>
               <w:rPr>
@@ -1979,18 +1899,8 @@
                 <w:bCs/>
                 <w:color w:val="1A5276"/>
               </w:rPr>
-              <w:t xml:space="preserve">Chinna Samy Ammal Government Boys HSS, </w:t>
-            </w:r>
-            <w:proofErr w:type="spellStart"/>
-            <w:r>
-              <w:rPr>
-                <w:b/>
-                <w:bCs/>
-                <w:color w:val="1A5276"/>
-              </w:rPr>
-              <w:t>Tiuppur</w:t>
-            </w:r>
-            <w:proofErr w:type="spellEnd"/>
+              <w:t>Chinna Samy Ammal Government Boys HSS, Tiuppur</w:t>
+            </w:r>
           </w:p>
         </w:tc>
         <w:tc>
@@ -2006,7 +1916,7 @@
           </w:tcPr>
           <w:p>
             <w:pPr>
-              <w:spacing w:before="100"/>
+              <w:spacing w:after="20" w:line="252" w:lineRule="auto"/>
               <w:jc w:val="right"/>
             </w:pPr>
             <w:r>
@@ -2020,6 +1930,7 @@
           </w:p>
           <w:p>
             <w:pPr>
+              <w:spacing w:after="20" w:line="252" w:lineRule="auto"/>
               <w:jc w:val="right"/>
             </w:pPr>
             <w:r>
@@ -2036,12 +1947,7 @@
     </w:tbl>
     <w:p>
       <w:pPr>
-        <w:spacing w:after="20"/>
-      </w:pPr>
-    </w:p>
-    <w:p>
-      <w:pPr>
-        <w:spacing w:before="100"/>
+        <w:spacing w:before="20" w:after="20" w:line="252" w:lineRule="auto"/>
         <w:rPr>
           <w:color w:val="566573"/>
           <w:sz w:val="18"/>
@@ -2055,27 +1961,7 @@
           <w:sz w:val="22"/>
           <w:szCs w:val="22"/>
         </w:rPr>
-        <w:t xml:space="preserve"> Secondary School Leaving Certificate (</w:t>
-      </w:r>
-      <w:proofErr w:type="gramStart"/>
-      <w:r>
-        <w:rPr>
-          <w:b/>
-          <w:bCs/>
-          <w:sz w:val="22"/>
-          <w:szCs w:val="22"/>
-        </w:rPr>
-        <w:t xml:space="preserve">SSLC)   </w:t>
-      </w:r>
-      <w:proofErr w:type="gramEnd"/>
-      <w:r>
-        <w:rPr>
-          <w:b/>
-          <w:bCs/>
-          <w:sz w:val="22"/>
-          <w:szCs w:val="22"/>
-        </w:rPr>
-        <w:t xml:space="preserve">  </w:t>
+        <w:t xml:space="preserve"> Secondary School Leaving Certificate (SSLC)     </w:t>
       </w:r>
       <w:r>
         <w:rPr>
@@ -2133,7 +2019,7 @@
     </w:p>
     <w:p>
       <w:pPr>
-        <w:spacing w:after="20"/>
+        <w:spacing w:before="20" w:after="20" w:line="252" w:lineRule="auto"/>
       </w:pPr>
       <w:r>
         <w:t xml:space="preserve"> </w:t>
@@ -2144,25 +2030,7 @@
           <w:bCs/>
           <w:color w:val="1A5276"/>
         </w:rPr>
-        <w:t xml:space="preserve">Chinna Samy Ammal Government Boys HSS, </w:t>
-      </w:r>
-      <w:proofErr w:type="spellStart"/>
-      <w:r>
-        <w:rPr>
-          <w:b/>
-          <w:bCs/>
-          <w:color w:val="1A5276"/>
-        </w:rPr>
-        <w:t>Tiuppur</w:t>
-      </w:r>
-      <w:proofErr w:type="spellEnd"/>
-      <w:r>
-        <w:rPr>
-          <w:b/>
-          <w:bCs/>
-          <w:color w:val="1A5276"/>
-        </w:rPr>
-        <w:t xml:space="preserve">                                                                      </w:t>
+        <w:t xml:space="preserve">Chinna Samy Ammal Government Boys HSS, Tiuppur                                                                      </w:t>
       </w:r>
       <w:r>
         <w:rPr>
@@ -2178,7 +2046,7 @@
         <w:pBdr>
           <w:bottom w:val="single" w:sz="8" w:space="4" w:color="1A5276"/>
         </w:pBdr>
-        <w:spacing w:before="200" w:after="60"/>
+        <w:spacing w:before="160" w:after="40" w:line="252" w:lineRule="auto"/>
       </w:pPr>
       <w:r>
         <w:rPr>
@@ -2232,6 +2100,9 @@
             </w:tcMar>
           </w:tcPr>
           <w:p>
+            <w:pPr>
+              <w:spacing w:after="20" w:line="252" w:lineRule="auto"/>
+            </w:pPr>
             <w:r>
               <w:rPr>
                 <w:b/>
@@ -2260,6 +2131,9 @@
             </w:tcMar>
           </w:tcPr>
           <w:p>
+            <w:pPr>
+              <w:spacing w:after="20" w:line="252" w:lineRule="auto"/>
+            </w:pPr>
             <w:r>
               <w:rPr>
                 <w:color w:val="566573"/>
@@ -2290,9 +2164,9 @@
           </w:tcPr>
           <w:p>
             <w:pPr>
+              <w:spacing w:after="20" w:line="252" w:lineRule="auto"/>
               <w:jc w:val="right"/>
             </w:pPr>
-            <w:proofErr w:type="gramStart"/>
             <w:r>
               <w:rPr>
                 <w:b/>
@@ -2301,29 +2175,7 @@
                 <w:sz w:val="19"/>
                 <w:szCs w:val="19"/>
               </w:rPr>
-              <w:t>Elite  |</w:t>
-            </w:r>
-            <w:proofErr w:type="gramEnd"/>
-            <w:r>
-              <w:rPr>
-                <w:b/>
-                <w:bCs/>
-                <w:color w:val="1A5276"/>
-                <w:sz w:val="19"/>
-                <w:szCs w:val="19"/>
-              </w:rPr>
-              <w:t xml:space="preserve">  82</w:t>
-            </w:r>
-            <w:proofErr w:type="gramStart"/>
-            <w:r>
-              <w:rPr>
-                <w:b/>
-                <w:bCs/>
-                <w:color w:val="1A5276"/>
-                <w:sz w:val="19"/>
-                <w:szCs w:val="19"/>
-              </w:rPr>
-              <w:t>%</w:t>
+              <w:t>Elite  |  82%</w:t>
             </w:r>
             <w:r>
               <w:rPr>
@@ -2331,16 +2183,7 @@
                 <w:sz w:val="17"/>
                 <w:szCs w:val="17"/>
               </w:rPr>
-              <w:t xml:space="preserve">  Jan</w:t>
-            </w:r>
-            <w:proofErr w:type="gramEnd"/>
-            <w:r>
-              <w:rPr>
-                <w:color w:val="566573"/>
-                <w:sz w:val="17"/>
-                <w:szCs w:val="17"/>
-              </w:rPr>
-              <w:t>–Apr 2026</w:t>
+              <w:t xml:space="preserve">  Jan–Apr 2026</w:t>
             </w:r>
           </w:p>
         </w:tc>
@@ -2348,12 +2191,7 @@
     </w:tbl>
     <w:p>
       <w:pPr>
-        <w:spacing w:before="80"/>
-      </w:pPr>
-    </w:p>
-    <w:p>
-      <w:pPr>
-        <w:spacing w:before="40"/>
+        <w:spacing w:before="20" w:after="20" w:line="252" w:lineRule="auto"/>
       </w:pPr>
       <w:r>
         <w:rPr>
@@ -2369,16 +2207,7 @@
           <w:sz w:val="17"/>
           <w:szCs w:val="17"/>
         </w:rPr>
-        <w:t>NPTEL26CS55S</w:t>
-      </w:r>
-      <w:proofErr w:type="gramStart"/>
-      <w:r>
-        <w:rPr>
-          <w:color w:val="1A5276"/>
-          <w:sz w:val="17"/>
-          <w:szCs w:val="17"/>
-        </w:rPr>
-        <w:t>1350500133</w:t>
+        <w:t>NPTEL26CS55S1350500133</w:t>
       </w:r>
       <w:r>
         <w:rPr>
@@ -2386,41 +2215,27 @@
           <w:sz w:val="17"/>
           <w:szCs w:val="17"/>
         </w:rPr>
-        <w:t xml:space="preserve">  ·</w:t>
-      </w:r>
-      <w:proofErr w:type="gramEnd"/>
-      <w:r>
-        <w:rPr>
-          <w:color w:val="566573"/>
-          <w:sz w:val="17"/>
-          <w:szCs w:val="17"/>
-        </w:rPr>
-        <w:t xml:space="preserve">  Ranked in top cohort among 33,252 certified candidates</w:t>
-      </w:r>
-    </w:p>
-    <w:p>
-      <w:pPr>
-        <w:spacing w:before="0" w:after="0" w:line="60" w:lineRule="exact"/>
-      </w:pPr>
+        <w:t xml:space="preserve">  ·  Ranked in top cohort among 33,252 certified candidates</w:t>
+      </w:r>
     </w:p>
     <w:tbl>
       <w:tblPr>
-        <w:tblW w:type="auto" w:w="0"/>
-        <w:tblLook w:firstColumn="1" w:firstRow="1" w:lastColumn="0" w:lastRow="0" w:noHBand="0" w:noVBand="1" w:val="04A0"/>
+        <w:tblW w:w="0" w:type="auto"/>
+        <w:tblLook w:val="04A0" w:firstRow="1" w:lastRow="0" w:firstColumn="1" w:lastColumn="0" w:noHBand="0" w:noVBand="1"/>
       </w:tblPr>
       <w:tblGrid>
-        <w:gridCol w:w="3360"/>
-        <w:gridCol w:w="3360"/>
-        <w:gridCol w:w="3360"/>
+        <w:gridCol w:w="4200"/>
+        <w:gridCol w:w="3000"/>
+        <w:gridCol w:w="2160"/>
       </w:tblGrid>
       <w:tr>
         <w:tc>
           <w:tcPr>
-            <w:tcW w:type="dxa" w:w="4200"/>
-          </w:tcPr>
-          <w:p>
-            <w:pPr>
-              <w:spacing w:before="0" w:after="0" w:line="276" w:lineRule="auto"/>
+            <w:tcW w:w="4200" w:type="dxa"/>
+          </w:tcPr>
+          <w:p>
+            <w:pPr>
+              <w:spacing w:after="20" w:line="252" w:lineRule="auto"/>
             </w:pPr>
             <w:r>
               <w:rPr>
@@ -2432,11 +2247,11 @@
         </w:tc>
         <w:tc>
           <w:tcPr>
-            <w:tcW w:type="dxa" w:w="3000"/>
-          </w:tcPr>
-          <w:p>
-            <w:pPr>
-              <w:spacing w:before="0" w:after="0" w:line="276" w:lineRule="auto"/>
+            <w:tcW w:w="3000" w:type="dxa"/>
+          </w:tcPr>
+          <w:p>
+            <w:pPr>
+              <w:spacing w:after="20" w:line="252" w:lineRule="auto"/>
             </w:pPr>
             <w:r>
               <w:rPr>
@@ -2448,15 +2263,15 @@
         </w:tc>
         <w:tc>
           <w:tcPr>
-            <w:tcW w:type="dxa" w:w="2160"/>
-          </w:tcPr>
-          <w:p>
-            <w:pPr>
-              <w:spacing w:before="0" w:after="0" w:line="276" w:lineRule="auto"/>
-            </w:pPr>
-            <w:r>
-              <w:rPr>
-                <w:b w:val="0"/>
+            <w:tcW w:w="2160" w:type="dxa"/>
+          </w:tcPr>
+          <w:p>
+            <w:pPr>
+              <w:spacing w:after="20" w:line="252" w:lineRule="auto"/>
+              <w:jc w:val="right"/>
+            </w:pPr>
+            <w:r>
+              <w:rPr>
                 <w:sz w:val="19"/>
               </w:rPr>
               <w:t>Nov 2025</w:t>
@@ -2467,7 +2282,7 @@
     </w:tbl>
     <w:p>
       <w:pPr>
-        <w:spacing w:before="20" w:after="80" w:line="276" w:lineRule="auto"/>
+        <w:spacing w:before="20" w:after="20" w:line="252" w:lineRule="auto"/>
       </w:pPr>
       <w:r>
         <w:rPr>
@@ -2475,30 +2290,25 @@
         </w:rPr>
         <w:t>Granted by Oracle Academy. Hands-on program covering neural networks, deep learning models, and Java integration.</w:t>
       </w:r>
-    </w:p>
-    <w:p>
-      <w:pPr>
-        <w:spacing w:before="0" w:after="0" w:line="60" w:lineRule="exact"/>
-      </w:pPr>
     </w:p>
     <w:tbl>
       <w:tblPr>
-        <w:tblW w:type="auto" w:w="0"/>
-        <w:tblLook w:firstColumn="1" w:firstRow="1" w:lastColumn="0" w:lastRow="0" w:noHBand="0" w:noVBand="1" w:val="04A0"/>
+        <w:tblW w:w="0" w:type="auto"/>
+        <w:tblLook w:val="04A0" w:firstRow="1" w:lastRow="0" w:firstColumn="1" w:lastColumn="0" w:noHBand="0" w:noVBand="1"/>
       </w:tblPr>
       <w:tblGrid>
-        <w:gridCol w:w="3360"/>
-        <w:gridCol w:w="3360"/>
-        <w:gridCol w:w="3360"/>
+        <w:gridCol w:w="4200"/>
+        <w:gridCol w:w="3000"/>
+        <w:gridCol w:w="2160"/>
       </w:tblGrid>
       <w:tr>
         <w:tc>
           <w:tcPr>
-            <w:tcW w:type="dxa" w:w="4200"/>
-          </w:tcPr>
-          <w:p>
-            <w:pPr>
-              <w:spacing w:before="0" w:after="0" w:line="276" w:lineRule="auto"/>
+            <w:tcW w:w="4200" w:type="dxa"/>
+          </w:tcPr>
+          <w:p>
+            <w:pPr>
+              <w:spacing w:after="20" w:line="252" w:lineRule="auto"/>
             </w:pPr>
             <w:r>
               <w:rPr>
@@ -2510,11 +2320,11 @@
         </w:tc>
         <w:tc>
           <w:tcPr>
-            <w:tcW w:type="dxa" w:w="3000"/>
-          </w:tcPr>
-          <w:p>
-            <w:pPr>
-              <w:spacing w:before="0" w:after="0" w:line="276" w:lineRule="auto"/>
+            <w:tcW w:w="3000" w:type="dxa"/>
+          </w:tcPr>
+          <w:p>
+            <w:pPr>
+              <w:spacing w:after="20" w:line="252" w:lineRule="auto"/>
             </w:pPr>
             <w:r>
               <w:rPr>
@@ -2526,11 +2336,12 @@
         </w:tc>
         <w:tc>
           <w:tcPr>
-            <w:tcW w:type="dxa" w:w="2160"/>
-          </w:tcPr>
-          <w:p>
-            <w:pPr>
-              <w:spacing w:before="0" w:after="0" w:line="276" w:lineRule="auto"/>
+            <w:tcW w:w="2160" w:type="dxa"/>
+          </w:tcPr>
+          <w:p>
+            <w:pPr>
+              <w:spacing w:after="20" w:line="252" w:lineRule="auto"/>
+              <w:jc w:val="right"/>
             </w:pPr>
             <w:r>
               <w:rPr>
@@ -2541,7 +2352,6 @@
             </w:r>
             <w:r>
               <w:rPr>
-                <w:b w:val="0"/>
                 <w:sz w:val="19"/>
               </w:rPr>
               <w:t xml:space="preserve">  |  2025</w:t>
@@ -2552,7 +2362,7 @@
     </w:tbl>
     <w:p>
       <w:pPr>
-        <w:spacing w:before="20" w:after="80" w:line="276" w:lineRule="auto"/>
+        <w:spacing w:before="20" w:after="20" w:line="252" w:lineRule="auto"/>
       </w:pPr>
       <w:r>
         <w:rPr>
@@ -2560,30 +2370,25 @@
         </w:rPr>
         <w:t>Organized by Sree Sakthi Engineering College and invigilated remotely by Spoken Tutorial Project, IIT Bombay.</w:t>
       </w:r>
-    </w:p>
-    <w:p>
-      <w:pPr>
-        <w:spacing w:before="0" w:after="0" w:line="60" w:lineRule="exact"/>
-      </w:pPr>
     </w:p>
     <w:tbl>
       <w:tblPr>
-        <w:tblW w:type="auto" w:w="0"/>
-        <w:tblLook w:firstColumn="1" w:firstRow="1" w:lastColumn="0" w:lastRow="0" w:noHBand="0" w:noVBand="1" w:val="04A0"/>
+        <w:tblW w:w="0" w:type="auto"/>
+        <w:tblLook w:val="04A0" w:firstRow="1" w:lastRow="0" w:firstColumn="1" w:lastColumn="0" w:noHBand="0" w:noVBand="1"/>
       </w:tblPr>
       <w:tblGrid>
-        <w:gridCol w:w="3360"/>
-        <w:gridCol w:w="3360"/>
-        <w:gridCol w:w="3360"/>
+        <w:gridCol w:w="4200"/>
+        <w:gridCol w:w="3000"/>
+        <w:gridCol w:w="2160"/>
       </w:tblGrid>
       <w:tr>
         <w:tc>
           <w:tcPr>
-            <w:tcW w:type="dxa" w:w="4200"/>
-          </w:tcPr>
-          <w:p>
-            <w:pPr>
-              <w:spacing w:before="0" w:after="0" w:line="276" w:lineRule="auto"/>
+            <w:tcW w:w="4200" w:type="dxa"/>
+          </w:tcPr>
+          <w:p>
+            <w:pPr>
+              <w:spacing w:after="20" w:line="252" w:lineRule="auto"/>
             </w:pPr>
             <w:r>
               <w:rPr>
@@ -2595,11 +2400,11 @@
         </w:tc>
         <w:tc>
           <w:tcPr>
-            <w:tcW w:type="dxa" w:w="3000"/>
-          </w:tcPr>
-          <w:p>
-            <w:pPr>
-              <w:spacing w:before="0" w:after="0" w:line="276" w:lineRule="auto"/>
+            <w:tcW w:w="3000" w:type="dxa"/>
+          </w:tcPr>
+          <w:p>
+            <w:pPr>
+              <w:spacing w:after="20" w:line="252" w:lineRule="auto"/>
             </w:pPr>
             <w:r>
               <w:rPr>
@@ -2611,11 +2416,12 @@
         </w:tc>
         <w:tc>
           <w:tcPr>
-            <w:tcW w:type="dxa" w:w="2160"/>
-          </w:tcPr>
-          <w:p>
-            <w:pPr>
-              <w:spacing w:before="0" w:after="0" w:line="276" w:lineRule="auto"/>
+            <w:tcW w:w="2160" w:type="dxa"/>
+          </w:tcPr>
+          <w:p>
+            <w:pPr>
+              <w:spacing w:after="20" w:line="252" w:lineRule="auto"/>
+              <w:jc w:val="right"/>
             </w:pPr>
             <w:r>
               <w:rPr>
@@ -2626,7 +2432,6 @@
             </w:r>
             <w:r>
               <w:rPr>
-                <w:b w:val="0"/>
                 <w:sz w:val="19"/>
               </w:rPr>
               <w:t xml:space="preserve">  |  2025</w:t>
@@ -2637,7 +2442,7 @@
     </w:tbl>
     <w:p>
       <w:pPr>
-        <w:spacing w:before="20" w:after="80" w:line="276" w:lineRule="auto"/>
+        <w:spacing w:before="20" w:after="20" w:line="252" w:lineRule="auto"/>
       </w:pPr>
       <w:r>
         <w:rPr>
@@ -2645,30 +2450,25 @@
         </w:rPr>
         <w:t>Organized by Sree Sakthi Engineering College and invigilated remotely by Spoken Tutorial Project, IIT Bombay.</w:t>
       </w:r>
-    </w:p>
-    <w:p>
-      <w:pPr>
-        <w:spacing w:before="0" w:after="0" w:line="60" w:lineRule="exact"/>
-      </w:pPr>
     </w:p>
     <w:tbl>
       <w:tblPr>
-        <w:tblW w:type="auto" w:w="0"/>
-        <w:tblLook w:firstColumn="1" w:firstRow="1" w:lastColumn="0" w:lastRow="0" w:noHBand="0" w:noVBand="1" w:val="04A0"/>
+        <w:tblW w:w="0" w:type="auto"/>
+        <w:tblLook w:val="04A0" w:firstRow="1" w:lastRow="0" w:firstColumn="1" w:lastColumn="0" w:noHBand="0" w:noVBand="1"/>
       </w:tblPr>
       <w:tblGrid>
-        <w:gridCol w:w="3360"/>
-        <w:gridCol w:w="3360"/>
-        <w:gridCol w:w="3360"/>
+        <w:gridCol w:w="4200"/>
+        <w:gridCol w:w="3000"/>
+        <w:gridCol w:w="2160"/>
       </w:tblGrid>
       <w:tr>
         <w:tc>
           <w:tcPr>
-            <w:tcW w:type="dxa" w:w="4200"/>
-          </w:tcPr>
-          <w:p>
-            <w:pPr>
-              <w:spacing w:before="0" w:after="0" w:line="276" w:lineRule="auto"/>
+            <w:tcW w:w="4200" w:type="dxa"/>
+          </w:tcPr>
+          <w:p>
+            <w:pPr>
+              <w:spacing w:after="20" w:line="252" w:lineRule="auto"/>
             </w:pPr>
             <w:r>
               <w:rPr>
@@ -2680,11 +2480,11 @@
         </w:tc>
         <w:tc>
           <w:tcPr>
-            <w:tcW w:type="dxa" w:w="3000"/>
-          </w:tcPr>
-          <w:p>
-            <w:pPr>
-              <w:spacing w:before="0" w:after="0" w:line="276" w:lineRule="auto"/>
+            <w:tcW w:w="3000" w:type="dxa"/>
+          </w:tcPr>
+          <w:p>
+            <w:pPr>
+              <w:spacing w:after="20" w:line="252" w:lineRule="auto"/>
             </w:pPr>
             <w:r>
               <w:rPr>
@@ -2696,11 +2496,12 @@
         </w:tc>
         <w:tc>
           <w:tcPr>
-            <w:tcW w:type="dxa" w:w="2160"/>
-          </w:tcPr>
-          <w:p>
-            <w:pPr>
-              <w:spacing w:before="0" w:after="0" w:line="276" w:lineRule="auto"/>
+            <w:tcW w:w="2160" w:type="dxa"/>
+          </w:tcPr>
+          <w:p>
+            <w:pPr>
+              <w:spacing w:after="20" w:line="252" w:lineRule="auto"/>
+              <w:jc w:val="right"/>
             </w:pPr>
             <w:r>
               <w:rPr>
@@ -2711,7 +2512,6 @@
             </w:r>
             <w:r>
               <w:rPr>
-                <w:b w:val="0"/>
                 <w:sz w:val="19"/>
               </w:rPr>
               <w:t xml:space="preserve">  |  2025</w:t>
@@ -2722,7 +2522,7 @@
     </w:tbl>
     <w:p>
       <w:pPr>
-        <w:spacing w:before="20" w:after="80" w:line="276" w:lineRule="auto"/>
+        <w:spacing w:before="20" w:after="20" w:line="252" w:lineRule="auto"/>
       </w:pPr>
       <w:r>
         <w:rPr>
@@ -2730,30 +2530,25 @@
         </w:rPr>
         <w:t>Organized by Sree Sakthi Engineering College and invigilated remotely by Spoken Tutorial Project, IIT Bombay.</w:t>
       </w:r>
-    </w:p>
-    <w:p>
-      <w:pPr>
-        <w:spacing w:before="0" w:after="0" w:line="60" w:lineRule="exact"/>
-      </w:pPr>
     </w:p>
     <w:tbl>
       <w:tblPr>
-        <w:tblW w:type="auto" w:w="0"/>
-        <w:tblLook w:firstColumn="1" w:firstRow="1" w:lastColumn="0" w:lastRow="0" w:noHBand="0" w:noVBand="1" w:val="04A0"/>
+        <w:tblW w:w="0" w:type="auto"/>
+        <w:tblLook w:val="04A0" w:firstRow="1" w:lastRow="0" w:firstColumn="1" w:lastColumn="0" w:noHBand="0" w:noVBand="1"/>
       </w:tblPr>
       <w:tblGrid>
-        <w:gridCol w:w="3360"/>
-        <w:gridCol w:w="3360"/>
-        <w:gridCol w:w="3360"/>
+        <w:gridCol w:w="4200"/>
+        <w:gridCol w:w="3000"/>
+        <w:gridCol w:w="2160"/>
       </w:tblGrid>
       <w:tr>
         <w:tc>
           <w:tcPr>
-            <w:tcW w:type="dxa" w:w="4200"/>
-          </w:tcPr>
-          <w:p>
-            <w:pPr>
-              <w:spacing w:before="0" w:after="0" w:line="276" w:lineRule="auto"/>
+            <w:tcW w:w="4200" w:type="dxa"/>
+          </w:tcPr>
+          <w:p>
+            <w:pPr>
+              <w:spacing w:after="20" w:line="252" w:lineRule="auto"/>
             </w:pPr>
             <w:r>
               <w:rPr>
@@ -2765,11 +2560,11 @@
         </w:tc>
         <w:tc>
           <w:tcPr>
-            <w:tcW w:type="dxa" w:w="3000"/>
-          </w:tcPr>
-          <w:p>
-            <w:pPr>
-              <w:spacing w:before="0" w:after="0" w:line="276" w:lineRule="auto"/>
+            <w:tcW w:w="3000" w:type="dxa"/>
+          </w:tcPr>
+          <w:p>
+            <w:pPr>
+              <w:spacing w:after="20" w:line="252" w:lineRule="auto"/>
             </w:pPr>
             <w:r>
               <w:rPr>
@@ -2781,11 +2576,12 @@
         </w:tc>
         <w:tc>
           <w:tcPr>
-            <w:tcW w:type="dxa" w:w="2160"/>
-          </w:tcPr>
-          <w:p>
-            <w:pPr>
-              <w:spacing w:before="0" w:after="0" w:line="276" w:lineRule="auto"/>
+            <w:tcW w:w="2160" w:type="dxa"/>
+          </w:tcPr>
+          <w:p>
+            <w:pPr>
+              <w:spacing w:after="20" w:line="252" w:lineRule="auto"/>
+              <w:jc w:val="right"/>
             </w:pPr>
             <w:r>
               <w:rPr>
@@ -2800,7 +2596,7 @@
     </w:tbl>
     <w:p>
       <w:pPr>
-        <w:spacing w:before="20" w:after="80" w:line="276" w:lineRule="auto"/>
+        <w:spacing w:before="20" w:after="20" w:line="252" w:lineRule="auto"/>
       </w:pPr>
       <w:r>
         <w:rPr>
@@ -2811,12 +2607,7 @@
     </w:p>
     <w:p>
       <w:pPr>
-        <w:spacing w:before="0" w:after="0" w:line="60" w:lineRule="exact"/>
-      </w:pPr>
-    </w:p>
-    <w:p>
-      <w:pPr>
-        <w:spacing w:before="200" w:after="60" w:line="276" w:lineRule="auto"/>
+        <w:spacing w:before="160" w:after="40" w:line="252" w:lineRule="auto"/>
       </w:pPr>
       <w:r>
         <w:rPr>
@@ -2828,81 +2619,93 @@
     </w:p>
     <w:p>
       <w:pPr>
-        <w:spacing w:before="40" w:after="40" w:line="276" w:lineRule="auto"/>
-      </w:pPr>
-      <w:r>
-        <w:rPr>
-          <w:b/>
-        </w:rPr>
-        <w:t xml:space="preserve">▸  </w:t>
-      </w:r>
-      <w:r>
-        <w:rPr>
-          <w:b/>
-        </w:rPr>
-        <w:t>Smart India Hackathon (SIH) Participant</w:t>
-      </w:r>
-      <w:r>
+        <w:spacing w:before="20" w:after="20" w:line="252" w:lineRule="auto"/>
+      </w:pPr>
+      <w:r>
+        <w:rPr>
+          <w:b/>
+        </w:rPr>
+        <w:t>▸</w:t>
+      </w:r>
+      <w:r>
+        <w:rPr>
+          <w:b/>
+        </w:rPr>
+        <w:t xml:space="preserve">  Smart India Hackathon (SIH) Participant</w:t>
+      </w:r>
+      <w:r>
+        <w:rPr>
+          <w:sz w:val="19"/>
+        </w:rPr>
         <w:t xml:space="preserve"> — Shortlisted for competing in nationwide problem-solving challenges using cloud computing modules.</w:t>
       </w:r>
     </w:p>
     <w:p>
       <w:pPr>
-        <w:spacing w:before="40" w:after="40" w:line="276" w:lineRule="auto"/>
-      </w:pPr>
-      <w:r>
-        <w:rPr>
-          <w:b/>
-        </w:rPr>
-        <w:t xml:space="preserve">▸  </w:t>
-      </w:r>
-      <w:r>
-        <w:rPr>
-          <w:b/>
-        </w:rPr>
-        <w:t>3rd Place, College Hackathon</w:t>
-      </w:r>
-      <w:r>
+        <w:spacing w:before="20" w:after="20" w:line="252" w:lineRule="auto"/>
+      </w:pPr>
+      <w:r>
+        <w:rPr>
+          <w:b/>
+        </w:rPr>
+        <w:t>▸</w:t>
+      </w:r>
+      <w:r>
+        <w:rPr>
+          <w:b/>
+        </w:rPr>
+        <w:t xml:space="preserve">  3rd Place, College Hackathon</w:t>
+      </w:r>
+      <w:r>
+        <w:rPr>
+          <w:sz w:val="19"/>
+        </w:rPr>
         <w:t xml:space="preserve"> — Awarded for engineering an automated digital interface solution under intense timeline pressure.</w:t>
       </w:r>
     </w:p>
     <w:p>
       <w:pPr>
-        <w:spacing w:before="40" w:after="40" w:line="276" w:lineRule="auto"/>
-      </w:pPr>
-      <w:r>
-        <w:rPr>
-          <w:b/>
-        </w:rPr>
-        <w:t xml:space="preserve">▸  </w:t>
-      </w:r>
-      <w:r>
-        <w:rPr>
-          <w:b/>
-        </w:rPr>
-        <w:t>National Conference Speaker/Participant</w:t>
-      </w:r>
-      <w:r>
+        <w:spacing w:before="20" w:after="20" w:line="252" w:lineRule="auto"/>
+      </w:pPr>
+      <w:r>
+        <w:rPr>
+          <w:b/>
+        </w:rPr>
+        <w:t>▸</w:t>
+      </w:r>
+      <w:r>
+        <w:rPr>
+          <w:b/>
+        </w:rPr>
+        <w:t xml:space="preserve">  National Conference Speaker/Participant</w:t>
+      </w:r>
+      <w:r>
+        <w:rPr>
+          <w:sz w:val="19"/>
+        </w:rPr>
         <w:t xml:space="preserve"> — Presented research abstracts evaluating security parameters in cloud and e-learning databases.</w:t>
       </w:r>
     </w:p>
     <w:p>
       <w:pPr>
-        <w:spacing w:before="40" w:after="40" w:line="276" w:lineRule="auto"/>
-      </w:pPr>
-      <w:r>
-        <w:rPr>
-          <w:b/>
-        </w:rPr>
-        <w:t xml:space="preserve">▸  </w:t>
-      </w:r>
-      <w:r>
-        <w:rPr>
-          <w:b/>
-        </w:rPr>
-        <w:t>HackerRank Gold Badge in Python</w:t>
-      </w:r>
-      <w:r>
+        <w:spacing w:before="20" w:after="20" w:line="252" w:lineRule="auto"/>
+      </w:pPr>
+      <w:r>
+        <w:rPr>
+          <w:b/>
+        </w:rPr>
+        <w:t>▸</w:t>
+      </w:r>
+      <w:r>
+        <w:rPr>
+          <w:b/>
+        </w:rPr>
+        <w:t xml:space="preserve">  HackerRank Gold Badge in Python</w:t>
+      </w:r>
+      <w:r>
+        <w:rPr>
+          <w:sz w:val="19"/>
+        </w:rPr>
         <w:t xml:space="preserve"> — Earned Python coding badges with high algorithmic accuracy on challenging hacker rank coding boards (hackerrank.com/profile/s_suresh63808661).</w:t>
       </w:r>
     </w:p>
@@ -2911,7 +2714,7 @@
         <w:pBdr>
           <w:bottom w:val="single" w:sz="8" w:space="4" w:color="1A5276"/>
         </w:pBdr>
-        <w:spacing w:before="200" w:after="60"/>
+        <w:spacing w:before="160" w:after="40" w:line="252" w:lineRule="auto"/>
       </w:pPr>
       <w:r>
         <w:rPr>
@@ -2926,27 +2729,26 @@
     </w:p>
     <w:p>
       <w:pPr>
-        <w:spacing w:before="40" w:after="40"/>
-      </w:pPr>
-      <w:proofErr w:type="gramStart"/>
-      <w:r>
-        <w:rPr>
-          <w:b/>
-          <w:bCs/>
-          <w:color w:val="1A5276"/>
-        </w:rPr>
-        <w:t xml:space="preserve">▸  </w:t>
-      </w:r>
-      <w:r>
-        <w:t>ISTE</w:t>
-      </w:r>
-      <w:proofErr w:type="gramEnd"/>
-      <w:r>
-        <w:t xml:space="preserve"> Association — Documentation </w:t>
-      </w:r>
-      <w:proofErr w:type="gramStart"/>
-      <w:r>
-        <w:t>Member</w:t>
+        <w:spacing w:before="20" w:after="20" w:line="252" w:lineRule="auto"/>
+      </w:pPr>
+      <w:r>
+        <w:rPr>
+          <w:b/>
+          <w:bCs/>
+          <w:color w:val="1A5276"/>
+        </w:rPr>
+        <w:t>▸</w:t>
+      </w:r>
+      <w:r>
+        <w:rPr>
+          <w:b/>
+          <w:bCs/>
+          <w:color w:val="1A5276"/>
+        </w:rPr>
+        <w:t xml:space="preserve">  </w:t>
+      </w:r>
+      <w:r>
+        <w:t>ISTE Association — Documentation Member</w:t>
       </w:r>
       <w:r>
         <w:rPr>
@@ -2956,44 +2758,36 @@
           <w:sz w:val="18"/>
           <w:szCs w:val="18"/>
         </w:rPr>
-        <w:t xml:space="preserve">  Sree</w:t>
-      </w:r>
-      <w:proofErr w:type="gramEnd"/>
-      <w:r>
-        <w:rPr>
-          <w:i/>
-          <w:iCs/>
-          <w:color w:val="566573"/>
-          <w:sz w:val="18"/>
-          <w:szCs w:val="18"/>
-        </w:rPr>
-        <w:t xml:space="preserve"> Sakthi Engineering College</w:t>
-      </w:r>
-    </w:p>
-    <w:p>
-      <w:pPr>
-        <w:spacing w:before="40" w:after="40"/>
-      </w:pPr>
-      <w:proofErr w:type="gramStart"/>
-      <w:r>
-        <w:rPr>
-          <w:b/>
-          <w:bCs/>
-          <w:color w:val="1A5276"/>
-        </w:rPr>
-        <w:t xml:space="preserve">▸  </w:t>
-      </w:r>
-      <w:r>
-        <w:t>Built</w:t>
-      </w:r>
-      <w:proofErr w:type="gramEnd"/>
-      <w:r>
-        <w:t xml:space="preserve"> and maintain a personal developer portfolio showcasing 8 live full-stack projects (https://suresh2160.github.io/portfolio1/)</w:t>
+        <w:t xml:space="preserve">  Sree Sakthi Engineering College</w:t>
+      </w:r>
+    </w:p>
+    <w:p>
+      <w:pPr>
+        <w:spacing w:before="20" w:after="20" w:line="252" w:lineRule="auto"/>
+      </w:pPr>
+      <w:r>
+        <w:rPr>
+          <w:b/>
+          <w:bCs/>
+          <w:color w:val="1A5276"/>
+        </w:rPr>
+        <w:t>▸</w:t>
+      </w:r>
+      <w:r>
+        <w:rPr>
+          <w:b/>
+          <w:bCs/>
+          <w:color w:val="1A5276"/>
+        </w:rPr>
+        <w:t xml:space="preserve">  </w:t>
+      </w:r>
+      <w:r>
+        <w:t>Built and maintain a personal developer portfolio showcasing 8 live full-stack projects (https://suresh2160.github.io/portfolio1/)</w:t>
       </w:r>
     </w:p>
     <w:sectPr>
       <w:pgSz w:w="12240" w:h="15840"/>
-      <w:pgMar w:top="900" w:right="1080" w:bottom="900" w:left="1080" w:header="708" w:footer="708" w:gutter="0"/>
+      <w:pgMar w:top="720" w:right="864" w:bottom="720" w:left="864" w:header="708" w:footer="708" w:gutter="0"/>
       <w:cols w:space="720"/>
       <w:docGrid w:linePitch="360"/>
     </w:sectPr>

</xml_diff>